<commit_message>
Regenerate docx with percentile stats and fig02a; update CLAUDE.md
Co-Authored-By: Claude Sonnet 4.6 <noreply@anthropic.com>
</commit_message>
<xml_diff>
--- a/initial_findings.docx
+++ b/initial_findings.docx
@@ -2,7 +2,7 @@
 <file path=word/document.xml><?xml version="1.0" encoding="utf-8"?>
 <w:document xmlns:w="http://schemas.openxmlformats.org/wordprocessingml/2006/main" xmlns:m="http://schemas.openxmlformats.org/officeDocument/2006/math" xmlns:r="http://schemas.openxmlformats.org/officeDocument/2006/relationships" xmlns:o="urn:schemas-microsoft-com:office:office" xmlns:v="urn:schemas-microsoft-com:vml" xmlns:w10="urn:schemas-microsoft-com:office:word" xmlns:a="http://schemas.openxmlformats.org/drawingml/2006/main" xmlns:pic="http://schemas.openxmlformats.org/drawingml/2006/picture" xmlns:wp="http://schemas.openxmlformats.org/drawingml/2006/wordprocessingDrawing">
   <w:body>
-    <w:bookmarkStart w:id="79" w:name="statistical-downscaling-initial-findings"/>
+    <w:bookmarkStart w:id="82" w:name="statistical-downscaling-initial-findings"/>
     <w:p>
       <w:pPr>
         <w:pStyle w:val="Heading1"/>
@@ -509,13 +509,25 @@
       </w:r>
     </w:p>
     <w:bookmarkEnd w:id="10"/>
-    <w:bookmarkStart w:id="11" w:name="main-statistics"/>
+    <w:bookmarkStart w:id="14" w:name="main-statistics"/>
     <w:p>
       <w:pPr>
         <w:pStyle w:val="Heading2"/>
       </w:pPr>
       <w:r>
         <w:t xml:space="preserve">3. Main Statistics</w:t>
+      </w:r>
+    </w:p>
+    <w:p>
+      <w:pPr>
+        <w:pStyle w:val="FirstParagraph"/>
+      </w:pPr>
+      <w:r>
+        <w:rPr>
+          <w:b/>
+          <w:bCs/>
+        </w:rPr>
+        <w:t xml:space="preserve">Dataset overview</w:t>
       </w:r>
     </w:p>
     <w:tbl>
@@ -683,55 +695,7 @@
               <w:pStyle w:val="Compact"/>
             </w:pPr>
             <w:r>
-              <w:t xml:space="preserve">ERA5-Land mean T2M</w:t>
-            </w:r>
-          </w:p>
-        </w:tc>
-        <w:tc>
-          <w:tcPr/>
-          <w:p>
-            <w:pPr>
-              <w:pStyle w:val="Compact"/>
-            </w:pPr>
-            <w:r>
-              <w:t xml:space="preserve">19.2°C</w:t>
-            </w:r>
-          </w:p>
-        </w:tc>
-      </w:tr>
-      <w:tr>
-        <w:tc>
-          <w:tcPr/>
-          <w:p>
-            <w:pPr>
-              <w:pStyle w:val="Compact"/>
-            </w:pPr>
-            <w:r>
-              <w:t xml:space="preserve">CMIP6 mean TAS</w:t>
-            </w:r>
-          </w:p>
-        </w:tc>
-        <w:tc>
-          <w:tcPr/>
-          <w:p>
-            <w:pPr>
-              <w:pStyle w:val="Compact"/>
-            </w:pPr>
-            <w:r>
-              <w:t xml:space="preserve">20.5°C</w:t>
-            </w:r>
-          </w:p>
-        </w:tc>
-      </w:tr>
-      <w:tr>
-        <w:tc>
-          <w:tcPr/>
-          <w:p>
-            <w:pPr>
-              <w:pStyle w:val="Compact"/>
-            </w:pPr>
-            <w:r>
-              <w:t xml:space="preserve">Missing data fraction</w:t>
+              <w:t xml:space="preserve">Missing / ocean fraction</w:t>
             </w:r>
           </w:p>
         </w:tc>
@@ -789,113 +753,318 @@
       </w:tr>
     </w:tbl>
     <w:p>
-      <w:r>
-        <w:pict>
-          <v:rect style="width:0;height:1.5pt" o:hralign="center" o:hrstd="t" o:hr="t"/>
-        </w:pict>
-      </w:r>
-    </w:p>
-    <w:bookmarkEnd w:id="11"/>
-    <w:bookmarkStart w:id="18" w:name="data-alignment-preprocessing"/>
-    <w:p>
-      <w:pPr>
-        <w:pStyle w:val="Heading2"/>
-      </w:pPr>
-      <w:r>
-        <w:t xml:space="preserve">4. Data Alignment &amp; Preprocessing</w:t>
-      </w:r>
-    </w:p>
-    <w:bookmarkStart w:id="12" w:name="calendar-harmonisation"/>
-    <w:p>
-      <w:pPr>
-        <w:pStyle w:val="Heading3"/>
-      </w:pPr>
-      <w:r>
-        <w:t xml:space="preserve">4.1 Calendar harmonisation</w:t>
-      </w:r>
-    </w:p>
-    <w:p>
-      <w:pPr>
-        <w:pStyle w:val="FirstParagraph"/>
-      </w:pPr>
-      <w:r>
-        <w:t xml:space="preserve">ERA5-Land adheres to the proleptic Gregorian calendar, which includes 29 February in leap years (1992 and 1996 within the study period). The CMIP6 CESM2-WACCM model employs a no-leap calendar (365 days per year). To produce a common time axis, the two ERA5-Land leap days were removed, yielding a shared record of</w:t>
-      </w:r>
-      <w:r>
-        <w:t xml:space="preserve"> </w:t>
-      </w:r>
+      <w:pPr>
+        <w:pStyle w:val="BodyText"/>
+      </w:pPr>
       <w:r>
         <w:rPr>
           <w:b/>
           <w:bCs/>
         </w:rPr>
-        <w:t xml:space="preserve">3,650 days</w:t>
-      </w:r>
-      <w:r>
-        <w:t xml:space="preserve"> </w:t>
-      </w:r>
-      <w:r>
-        <w:t xml:space="preserve">spanning 1 January 1990 to 31 December 1999.</w:t>
-      </w:r>
-    </w:p>
-    <w:bookmarkEnd w:id="12"/>
-    <w:bookmarkStart w:id="13" w:name="unit-conversion"/>
-    <w:p>
-      <w:pPr>
-        <w:pStyle w:val="Heading3"/>
-      </w:pPr>
-      <w:r>
-        <w:t xml:space="preserve">4.2 Unit conversion</w:t>
-      </w:r>
-    </w:p>
-    <w:p>
-      <w:pPr>
-        <w:pStyle w:val="FirstParagraph"/>
-      </w:pPr>
-      <w:r>
-        <w:t xml:space="preserve">Both datasets store temperature in Kelvin (K). Values were converted to degrees Celsius (°C) by subtracting 273.15 K.</w:t>
-      </w:r>
-    </w:p>
-    <w:bookmarkEnd w:id="13"/>
-    <w:bookmarkStart w:id="17" w:name="landsea-mask-and-missing-values"/>
-    <w:p>
-      <w:pPr>
-        <w:pStyle w:val="Heading3"/>
-      </w:pPr>
-      <w:r>
-        <w:t xml:space="preserve">4.3 Land–sea mask and missing values</w:t>
-      </w:r>
-    </w:p>
-    <w:p>
-      <w:pPr>
-        <w:pStyle w:val="FirstParagraph"/>
-      </w:pPr>
-      <w:r>
-        <w:t xml:space="preserve">ERA5-Land provides data exclusively over land grid cells; oceanic pixels are assigned NaN. Approximately</w:t>
-      </w:r>
-      <w:r>
-        <w:t xml:space="preserve"> </w:t>
-      </w:r>
-      <w:r>
-        <w:rPr>
-          <w:b/>
-          <w:bCs/>
-        </w:rPr>
-        <w:t xml:space="preserve">32.7%</w:t>
-      </w:r>
-      <w:r>
-        <w:t xml:space="preserve"> </w:t>
-      </w:r>
-      <w:r>
-        <w:t xml:space="preserve">of grid cells in the target domain contain missing values. This is a structural property of the dataset, not a data quality issue — the same pixels are missing on every day in the record, consistent with a static land–sea mask. The missing pattern aligns precisely with the Eastern Mediterranean Sea, the Red Sea, and the Persian Gulf.</w:t>
-      </w:r>
-    </w:p>
+        <w:t xml:space="preserve">Descriptive statistics — temperature distribution (°C)</w:t>
+      </w:r>
+    </w:p>
+    <w:tbl>
+      <w:tblPr>
+        <w:tblStyle w:val="Table"/>
+        <w:tblW w:type="auto" w:w="0"/>
+        <w:tblLook w:firstRow="1" w:lastRow="0" w:firstColumn="0" w:lastColumn="0" w:noHBand="0" w:noVBand="0" w:val="0020"/>
+      </w:tblPr>
+      <w:tblGrid>
+        <w:gridCol w:w="2640"/>
+        <w:gridCol w:w="2640"/>
+        <w:gridCol w:w="2640"/>
+      </w:tblGrid>
+      <w:tr>
+        <w:trPr>
+          <w:tblHeader w:val="on"/>
+        </w:trPr>
+        <w:tc>
+          <w:tcPr/>
+          <w:p>
+            <w:pPr>
+              <w:pStyle w:val="Compact"/>
+            </w:pPr>
+            <w:r>
+              <w:t xml:space="preserve">Statistic</w:t>
+            </w:r>
+          </w:p>
+        </w:tc>
+        <w:tc>
+          <w:tcPr/>
+          <w:p>
+            <w:pPr>
+              <w:pStyle w:val="Compact"/>
+            </w:pPr>
+            <w:r>
+              <w:t xml:space="preserve">ERA5-Land T2M</w:t>
+            </w:r>
+          </w:p>
+        </w:tc>
+        <w:tc>
+          <w:tcPr/>
+          <w:p>
+            <w:pPr>
+              <w:pStyle w:val="Compact"/>
+            </w:pPr>
+            <w:r>
+              <w:t xml:space="preserve">CMIP6 TAS</w:t>
+            </w:r>
+          </w:p>
+        </w:tc>
+      </w:tr>
+      <w:tr>
+        <w:tc>
+          <w:tcPr/>
+          <w:p>
+            <w:pPr>
+              <w:pStyle w:val="Compact"/>
+            </w:pPr>
+            <w:r>
+              <w:t xml:space="preserve">Minimum</w:t>
+            </w:r>
+          </w:p>
+        </w:tc>
+        <w:tc>
+          <w:tcPr/>
+          <w:p>
+            <w:pPr>
+              <w:pStyle w:val="Compact"/>
+            </w:pPr>
+            <w:r>
+              <w:t xml:space="preserve">−21.3</w:t>
+            </w:r>
+          </w:p>
+        </w:tc>
+        <w:tc>
+          <w:tcPr/>
+          <w:p>
+            <w:pPr>
+              <w:pStyle w:val="Compact"/>
+            </w:pPr>
+            <w:r>
+              <w:t xml:space="preserve">−14.7</w:t>
+            </w:r>
+          </w:p>
+        </w:tc>
+      </w:tr>
+      <w:tr>
+        <w:tc>
+          <w:tcPr/>
+          <w:p>
+            <w:pPr>
+              <w:pStyle w:val="Compact"/>
+            </w:pPr>
+            <w:r>
+              <w:t xml:space="preserve">25th percentile</w:t>
+            </w:r>
+          </w:p>
+        </w:tc>
+        <w:tc>
+          <w:tcPr/>
+          <w:p>
+            <w:pPr>
+              <w:pStyle w:val="Compact"/>
+            </w:pPr>
+            <w:r>
+              <w:t xml:space="preserve">12.7</w:t>
+            </w:r>
+          </w:p>
+        </w:tc>
+        <w:tc>
+          <w:tcPr/>
+          <w:p>
+            <w:pPr>
+              <w:pStyle w:val="Compact"/>
+            </w:pPr>
+            <w:r>
+              <w:t xml:space="preserve">15.0</w:t>
+            </w:r>
+          </w:p>
+        </w:tc>
+      </w:tr>
+      <w:tr>
+        <w:tc>
+          <w:tcPr/>
+          <w:p>
+            <w:pPr>
+              <w:pStyle w:val="Compact"/>
+            </w:pPr>
+            <w:r>
+              <w:t xml:space="preserve">Median (50th percentile)</w:t>
+            </w:r>
+          </w:p>
+        </w:tc>
+        <w:tc>
+          <w:tcPr/>
+          <w:p>
+            <w:pPr>
+              <w:pStyle w:val="Compact"/>
+            </w:pPr>
+            <w:r>
+              <w:t xml:space="preserve">20.1</w:t>
+            </w:r>
+          </w:p>
+        </w:tc>
+        <w:tc>
+          <w:tcPr/>
+          <w:p>
+            <w:pPr>
+              <w:pStyle w:val="Compact"/>
+            </w:pPr>
+            <w:r>
+              <w:t xml:space="preserve">21.2</w:t>
+            </w:r>
+          </w:p>
+        </w:tc>
+      </w:tr>
+      <w:tr>
+        <w:tc>
+          <w:tcPr/>
+          <w:p>
+            <w:pPr>
+              <w:pStyle w:val="Compact"/>
+            </w:pPr>
+            <w:r>
+              <w:t xml:space="preserve">Mean</w:t>
+            </w:r>
+          </w:p>
+        </w:tc>
+        <w:tc>
+          <w:tcPr/>
+          <w:p>
+            <w:pPr>
+              <w:pStyle w:val="Compact"/>
+            </w:pPr>
+            <w:r>
+              <w:t xml:space="preserve">19.2</w:t>
+            </w:r>
+          </w:p>
+        </w:tc>
+        <w:tc>
+          <w:tcPr/>
+          <w:p>
+            <w:pPr>
+              <w:pStyle w:val="Compact"/>
+            </w:pPr>
+            <w:r>
+              <w:t xml:space="preserve">20.8</w:t>
+            </w:r>
+          </w:p>
+        </w:tc>
+      </w:tr>
+      <w:tr>
+        <w:tc>
+          <w:tcPr/>
+          <w:p>
+            <w:pPr>
+              <w:pStyle w:val="Compact"/>
+            </w:pPr>
+            <w:r>
+              <w:t xml:space="preserve">75th percentile</w:t>
+            </w:r>
+          </w:p>
+        </w:tc>
+        <w:tc>
+          <w:tcPr/>
+          <w:p>
+            <w:pPr>
+              <w:pStyle w:val="Compact"/>
+            </w:pPr>
+            <w:r>
+              <w:t xml:space="preserve">26.3</w:t>
+            </w:r>
+          </w:p>
+        </w:tc>
+        <w:tc>
+          <w:tcPr/>
+          <w:p>
+            <w:pPr>
+              <w:pStyle w:val="Compact"/>
+            </w:pPr>
+            <w:r>
+              <w:t xml:space="preserve">27.0</w:t>
+            </w:r>
+          </w:p>
+        </w:tc>
+      </w:tr>
+      <w:tr>
+        <w:tc>
+          <w:tcPr/>
+          <w:p>
+            <w:pPr>
+              <w:pStyle w:val="Compact"/>
+            </w:pPr>
+            <w:r>
+              <w:t xml:space="preserve">90th percentile</w:t>
+            </w:r>
+          </w:p>
+        </w:tc>
+        <w:tc>
+          <w:tcPr/>
+          <w:p>
+            <w:pPr>
+              <w:pStyle w:val="Compact"/>
+            </w:pPr>
+            <w:r>
+              <w:t xml:space="preserve">29.7</w:t>
+            </w:r>
+          </w:p>
+        </w:tc>
+        <w:tc>
+          <w:tcPr/>
+          <w:p>
+            <w:pPr>
+              <w:pStyle w:val="Compact"/>
+            </w:pPr>
+            <w:r>
+              <w:t xml:space="preserve">31.1</w:t>
+            </w:r>
+          </w:p>
+        </w:tc>
+      </w:tr>
+      <w:tr>
+        <w:tc>
+          <w:tcPr/>
+          <w:p>
+            <w:pPr>
+              <w:pStyle w:val="Compact"/>
+            </w:pPr>
+            <w:r>
+              <w:t xml:space="preserve">Maximum</w:t>
+            </w:r>
+          </w:p>
+        </w:tc>
+        <w:tc>
+          <w:tcPr/>
+          <w:p>
+            <w:pPr>
+              <w:pStyle w:val="Compact"/>
+            </w:pPr>
+            <w:r>
+              <w:t xml:space="preserve">40.6</w:t>
+            </w:r>
+          </w:p>
+        </w:tc>
+        <w:tc>
+          <w:tcPr/>
+          <w:p>
+            <w:pPr>
+              <w:pStyle w:val="Compact"/>
+            </w:pPr>
+            <w:r>
+              <w:t xml:space="preserve">41.5</w:t>
+            </w:r>
+          </w:p>
+        </w:tc>
+      </w:tr>
+    </w:tbl>
     <w:p>
       <w:pPr>
         <w:pStyle w:val="BodyText"/>
       </w:pPr>
       <w:r>
-        <w:t xml:space="preserve">The binary map below shows which pixels contribute to the analysis. Land pixels are shown in green; ocean (no-data) pixels in blue.</w:t>
+        <w:t xml:space="preserve">ERA5-Land statistics are computed over land pixels only (ocean = NaN); CMIP6 statistics cover all grid cells in the subsetted domain. The CMIP6 distribution is shifted ~1–2°C warmer than ERA5-Land across all quantiles. Both distributions are negatively skewed relative to a normal distribution (mean &lt; median), reflecting the asymmetric thermal gradient between the hot Arabian Peninsula and the cooler northern highlands. The 90th–75th percentile gap (~3.4°C for ERA5-Land) is narrower than the 25th–minimum gap (~34°C), confirming a long lower tail driven by high-altitude winter pixels.</w:t>
       </w:r>
     </w:p>
     <w:p>
@@ -905,20 +1074,203 @@
       <w:r>
         <w:drawing>
           <wp:inline>
-            <wp:extent cx="4898243" cy="9189949"/>
+            <wp:extent cx="5334000" cy="2910831"/>
             <wp:effectExtent b="0" l="0" r="0" t="0"/>
-            <wp:docPr descr="Fig. 1b" title="" id="15" name="Picture"/>
+            <wp:docPr descr="Fig. 2a" title="" id="12" name="Picture"/>
             <a:graphic>
               <a:graphicData uri="http://schemas.openxmlformats.org/drawingml/2006/picture">
                 <pic:pic>
                   <pic:nvPicPr>
-                    <pic:cNvPr descr="plots/fig01b_land_sea_mask.png" id="16" name="Picture"/>
+                    <pic:cNvPr descr="plots/fig02a_temperature_distribution.png" id="13" name="Picture"/>
                     <pic:cNvPicPr>
                       <a:picLocks noChangeArrowheads="1" noChangeAspect="1"/>
                     </pic:cNvPicPr>
                   </pic:nvPicPr>
                   <pic:blipFill>
-                    <a:blip r:embed="rId14"/>
+                    <a:blip r:embed="rId11"/>
+                    <a:stretch>
+                      <a:fillRect/>
+                    </a:stretch>
+                  </pic:blipFill>
+                  <pic:spPr bwMode="auto">
+                    <a:xfrm>
+                      <a:off x="0" y="0"/>
+                      <a:ext cx="5334000" cy="2910831"/>
+                    </a:xfrm>
+                    <a:prstGeom prst="rect">
+                      <a:avLst/>
+                    </a:prstGeom>
+                    <a:noFill/>
+                    <a:ln w="9525">
+                      <a:noFill/>
+                      <a:headEnd/>
+                      <a:tailEnd/>
+                    </a:ln>
+                  </pic:spPr>
+                </pic:pic>
+              </a:graphicData>
+            </a:graphic>
+          </wp:inline>
+        </w:drawing>
+      </w:r>
+    </w:p>
+    <w:p>
+      <w:pPr>
+        <w:pStyle w:val="ImageCaption"/>
+      </w:pPr>
+      <w:r>
+        <w:t xml:space="preserve">Fig. 2a</w:t>
+      </w:r>
+    </w:p>
+    <w:p>
+      <w:pPr>
+        <w:pStyle w:val="BodyText"/>
+      </w:pPr>
+      <w:r>
+        <w:rPr>
+          <w:b/>
+          <w:bCs/>
+        </w:rPr>
+        <w:t xml:space="preserve">Fig. 2a.</w:t>
+      </w:r>
+      <w:r>
+        <w:t xml:space="preserve"> </w:t>
+      </w:r>
+      <w:r>
+        <w:t xml:space="preserve">Daily 2 m temperature distribution for ERA5-Land (blue, land pixels only) and CMIP6 CESM2-WACCM (orange, all domain cells), 1990–1999. Curves show probability density estimated from all pixel × day values. Dashed vertical lines mark the 25th, 50th, 75th, and 90th percentiles for each dataset. Data: ERA5-Land T2M and CMIP6 TAS, 24–38°N, 30–38°E.</w:t>
+      </w:r>
+    </w:p>
+    <w:p>
+      <w:r>
+        <w:pict>
+          <v:rect style="width:0;height:1.5pt" o:hralign="center" o:hrstd="t" o:hr="t"/>
+        </w:pict>
+      </w:r>
+    </w:p>
+    <w:bookmarkEnd w:id="14"/>
+    <w:bookmarkStart w:id="21" w:name="data-alignment-preprocessing"/>
+    <w:p>
+      <w:pPr>
+        <w:pStyle w:val="Heading2"/>
+      </w:pPr>
+      <w:r>
+        <w:t xml:space="preserve">4. Data Alignment &amp; Preprocessing</w:t>
+      </w:r>
+    </w:p>
+    <w:bookmarkStart w:id="15" w:name="calendar-harmonisation"/>
+    <w:p>
+      <w:pPr>
+        <w:pStyle w:val="Heading3"/>
+      </w:pPr>
+      <w:r>
+        <w:t xml:space="preserve">4.1 Calendar harmonisation</w:t>
+      </w:r>
+    </w:p>
+    <w:p>
+      <w:pPr>
+        <w:pStyle w:val="FirstParagraph"/>
+      </w:pPr>
+      <w:r>
+        <w:t xml:space="preserve">ERA5-Land adheres to the proleptic Gregorian calendar, which includes 29 February in leap years (1992 and 1996 within the study period). The CMIP6 CESM2-WACCM model employs a no-leap calendar (365 days per year). To produce a common time axis, the two ERA5-Land leap days were removed, yielding a shared record of</w:t>
+      </w:r>
+      <w:r>
+        <w:t xml:space="preserve"> </w:t>
+      </w:r>
+      <w:r>
+        <w:rPr>
+          <w:b/>
+          <w:bCs/>
+        </w:rPr>
+        <w:t xml:space="preserve">3,650 days</w:t>
+      </w:r>
+      <w:r>
+        <w:t xml:space="preserve"> </w:t>
+      </w:r>
+      <w:r>
+        <w:t xml:space="preserve">spanning 1 January 1990 to 31 December 1999.</w:t>
+      </w:r>
+    </w:p>
+    <w:bookmarkEnd w:id="15"/>
+    <w:bookmarkStart w:id="16" w:name="unit-conversion"/>
+    <w:p>
+      <w:pPr>
+        <w:pStyle w:val="Heading3"/>
+      </w:pPr>
+      <w:r>
+        <w:t xml:space="preserve">4.2 Unit conversion</w:t>
+      </w:r>
+    </w:p>
+    <w:p>
+      <w:pPr>
+        <w:pStyle w:val="FirstParagraph"/>
+      </w:pPr>
+      <w:r>
+        <w:t xml:space="preserve">Both datasets store temperature in Kelvin (K). Values were converted to degrees Celsius (°C) by subtracting 273.15 K.</w:t>
+      </w:r>
+    </w:p>
+    <w:bookmarkEnd w:id="16"/>
+    <w:bookmarkStart w:id="20" w:name="landsea-mask-and-missing-values"/>
+    <w:p>
+      <w:pPr>
+        <w:pStyle w:val="Heading3"/>
+      </w:pPr>
+      <w:r>
+        <w:t xml:space="preserve">4.3 Land–sea mask and missing values</w:t>
+      </w:r>
+    </w:p>
+    <w:p>
+      <w:pPr>
+        <w:pStyle w:val="FirstParagraph"/>
+      </w:pPr>
+      <w:r>
+        <w:t xml:space="preserve">ERA5-Land provides data exclusively over land grid cells; oceanic pixels are assigned NaN. Approximately</w:t>
+      </w:r>
+      <w:r>
+        <w:t xml:space="preserve"> </w:t>
+      </w:r>
+      <w:r>
+        <w:rPr>
+          <w:b/>
+          <w:bCs/>
+        </w:rPr>
+        <w:t xml:space="preserve">32.7%</w:t>
+      </w:r>
+      <w:r>
+        <w:t xml:space="preserve"> </w:t>
+      </w:r>
+      <w:r>
+        <w:t xml:space="preserve">of grid cells in the target domain contain missing values. This is a structural property of the dataset, not a data quality issue — the same pixels are missing on every day in the record, consistent with a static land–sea mask. The missing pattern aligns precisely with the Eastern Mediterranean Sea, the Red Sea, and the Persian Gulf.</w:t>
+      </w:r>
+    </w:p>
+    <w:p>
+      <w:pPr>
+        <w:pStyle w:val="BodyText"/>
+      </w:pPr>
+      <w:r>
+        <w:t xml:space="preserve">The binary map below shows which pixels contribute to the analysis. Land pixels are shown in green; ocean (no-data) pixels in blue.</w:t>
+      </w:r>
+    </w:p>
+    <w:p>
+      <w:pPr>
+        <w:pStyle w:val="CaptionedFigure"/>
+      </w:pPr>
+      <w:r>
+        <w:drawing>
+          <wp:inline>
+            <wp:extent cx="4898243" cy="9189949"/>
+            <wp:effectExtent b="0" l="0" r="0" t="0"/>
+            <wp:docPr descr="Fig. 1b" title="" id="18" name="Picture"/>
+            <a:graphic>
+              <a:graphicData uri="http://schemas.openxmlformats.org/drawingml/2006/picture">
+                <pic:pic>
+                  <pic:nvPicPr>
+                    <pic:cNvPr descr="plots/fig01b_land_sea_mask.png" id="19" name="Picture"/>
+                    <pic:cNvPicPr>
+                      <a:picLocks noChangeArrowheads="1" noChangeAspect="1"/>
+                    </pic:cNvPicPr>
+                  </pic:nvPicPr>
+                  <pic:blipFill>
+                    <a:blip r:embed="rId17"/>
                     <a:stretch>
                       <a:fillRect/>
                     </a:stretch>
@@ -978,9 +1330,9 @@
         </w:pict>
       </w:r>
     </w:p>
-    <w:bookmarkEnd w:id="17"/>
-    <w:bookmarkEnd w:id="18"/>
-    <w:bookmarkStart w:id="51" w:name="exploratory-descriptive-analysis"/>
+    <w:bookmarkEnd w:id="20"/>
+    <w:bookmarkEnd w:id="21"/>
+    <w:bookmarkStart w:id="54" w:name="exploratory-descriptive-analysis"/>
     <w:p>
       <w:pPr>
         <w:pStyle w:val="Heading2"/>
@@ -989,7 +1341,7 @@
         <w:t xml:space="preserve">5. Exploratory &amp; Descriptive Analysis</w:t>
       </w:r>
     </w:p>
-    <w:bookmarkStart w:id="28" w:name="temporal-variation"/>
+    <w:bookmarkStart w:id="31" w:name="temporal-variation"/>
     <w:p>
       <w:pPr>
         <w:pStyle w:val="Heading3"/>
@@ -1015,93 +1367,12 @@
           <wp:inline>
             <wp:extent cx="5334000" cy="1718532"/>
             <wp:effectExtent b="0" l="0" r="0" t="0"/>
-            <wp:docPr descr="Fig. 3a" title="" id="20" name="Picture"/>
+            <wp:docPr descr="Fig. 3a" title="" id="23" name="Picture"/>
             <a:graphic>
               <a:graphicData uri="http://schemas.openxmlformats.org/drawingml/2006/picture">
                 <pic:pic>
                   <pic:nvPicPr>
-                    <pic:cNvPr descr="plots/fig03a_domain_timeseries_full.png" id="21" name="Picture"/>
-                    <pic:cNvPicPr>
-                      <a:picLocks noChangeArrowheads="1" noChangeAspect="1"/>
-                    </pic:cNvPicPr>
-                  </pic:nvPicPr>
-                  <pic:blipFill>
-                    <a:blip r:embed="rId19"/>
-                    <a:stretch>
-                      <a:fillRect/>
-                    </a:stretch>
-                  </pic:blipFill>
-                  <pic:spPr bwMode="auto">
-                    <a:xfrm>
-                      <a:off x="0" y="0"/>
-                      <a:ext cx="5334000" cy="1718532"/>
-                    </a:xfrm>
-                    <a:prstGeom prst="rect">
-                      <a:avLst/>
-                    </a:prstGeom>
-                    <a:noFill/>
-                    <a:ln w="9525">
-                      <a:noFill/>
-                      <a:headEnd/>
-                      <a:tailEnd/>
-                    </a:ln>
-                  </pic:spPr>
-                </pic:pic>
-              </a:graphicData>
-            </a:graphic>
-          </wp:inline>
-        </w:drawing>
-      </w:r>
-    </w:p>
-    <w:p>
-      <w:pPr>
-        <w:pStyle w:val="ImageCaption"/>
-      </w:pPr>
-      <w:r>
-        <w:t xml:space="preserve">Fig. 3a</w:t>
-      </w:r>
-    </w:p>
-    <w:p>
-      <w:pPr>
-        <w:pStyle w:val="BodyText"/>
-      </w:pPr>
-      <w:r>
-        <w:rPr>
-          <w:b/>
-          <w:bCs/>
-        </w:rPr>
-        <w:t xml:space="preserve">Fig. 3a.</w:t>
-      </w:r>
-      <w:r>
-        <w:t xml:space="preserve"> </w:t>
-      </w:r>
-      <w:r>
-        <w:t xml:space="preserve">Domain-averaged daily 2 m temperature, 1990–1999. ERA5-Land (blue) and CMIP6 CESM2-WACCM (orange) are shown for all 3,650 days. Both datasets exhibit the same unimodal seasonal cycle; CMIP6 is systematically ~1–2°C warmer. Data: ERA5-Land T2M and CMIP6 TAS, 24–38°N, 30–38°E.</w:t>
-      </w:r>
-    </w:p>
-    <w:p>
-      <w:pPr>
-        <w:pStyle w:val="BodyText"/>
-      </w:pPr>
-      <w:r>
-        <w:t xml:space="preserve">The monthly climatology (Fig. 3b) summarises the seasonal cycle and confirms that the warm bias is present in all months but is largest in February–March.</w:t>
-      </w:r>
-    </w:p>
-    <w:p>
-      <w:pPr>
-        <w:pStyle w:val="CaptionedFigure"/>
-      </w:pPr>
-      <w:r>
-        <w:drawing>
-          <wp:inline>
-            <wp:extent cx="5334000" cy="1718532"/>
-            <wp:effectExtent b="0" l="0" r="0" t="0"/>
-            <wp:docPr descr="Fig. 3 (monthly trend)" title="" id="23" name="Picture"/>
-            <a:graphic>
-              <a:graphicData uri="http://schemas.openxmlformats.org/drawingml/2006/picture">
-                <pic:pic>
-                  <pic:nvPicPr>
-                    <pic:cNvPr descr="plots/fig03_monthly_trend.png" id="24" name="Picture"/>
+                    <pic:cNvPr descr="plots/fig03a_domain_timeseries_full.png" id="24" name="Picture"/>
                     <pic:cNvPicPr>
                       <a:picLocks noChangeArrowheads="1" noChangeAspect="1"/>
                     </pic:cNvPicPr>
@@ -1139,7 +1410,7 @@
         <w:pStyle w:val="ImageCaption"/>
       </w:pPr>
       <w:r>
-        <w:t xml:space="preserve">Fig. 3 (monthly trend)</w:t>
+        <w:t xml:space="preserve">Fig. 3a</w:t>
       </w:r>
     </w:p>
     <w:p>
@@ -1151,13 +1422,21 @@
           <w:b/>
           <w:bCs/>
         </w:rPr>
-        <w:t xml:space="preserve">Fig. 3 (monthly trend).</w:t>
-      </w:r>
-      <w:r>
-        <w:t xml:space="preserve"> </w:t>
-      </w:r>
-      <w:r>
-        <w:t xml:space="preserve">Monthly domain-mean 2 m temperature, 1990–1999. Each point is the area-averaged temperature for one calendar month (120 points total, Jan 1990 → Dec 1999), revealing year-to-year variability within each season. The warm bias of CMIP6 CESM2-WACCM (~1–2°C) persists throughout the decade. Data: ERA5-Land T2M and CMIP6 TAS, 24–38°N, 30–38°E.</w:t>
+        <w:t xml:space="preserve">Fig. 3a.</w:t>
+      </w:r>
+      <w:r>
+        <w:t xml:space="preserve"> </w:t>
+      </w:r>
+      <w:r>
+        <w:t xml:space="preserve">Domain-averaged daily 2 m temperature, 1990–1999. ERA5-Land (blue) and CMIP6 CESM2-WACCM (orange) are shown for all 3,650 days. Both datasets exhibit the same unimodal seasonal cycle; CMIP6 is systematically ~1–2°C warmer. Data: ERA5-Land T2M and CMIP6 TAS, 24–38°N, 30–38°E.</w:t>
+      </w:r>
+    </w:p>
+    <w:p>
+      <w:pPr>
+        <w:pStyle w:val="BodyText"/>
+      </w:pPr>
+      <w:r>
+        <w:t xml:space="preserve">The monthly climatology (Fig. 3b) summarises the seasonal cycle and confirms that the warm bias is present in all months but is largest in February–March.</w:t>
       </w:r>
     </w:p>
     <w:p>
@@ -1167,20 +1446,93 @@
       <w:r>
         <w:drawing>
           <wp:inline>
-            <wp:extent cx="5334000" cy="2340761"/>
+            <wp:extent cx="5334000" cy="1718532"/>
             <wp:effectExtent b="0" l="0" r="0" t="0"/>
-            <wp:docPr descr="Fig. 3b" title="" id="26" name="Picture"/>
+            <wp:docPr descr="Fig. 3 (monthly trend)" title="" id="26" name="Picture"/>
             <a:graphic>
               <a:graphicData uri="http://schemas.openxmlformats.org/drawingml/2006/picture">
                 <pic:pic>
                   <pic:nvPicPr>
-                    <pic:cNvPr descr="plots/fig03b_monthly_climatology.png" id="27" name="Picture"/>
+                    <pic:cNvPr descr="plots/fig03_monthly_trend.png" id="27" name="Picture"/>
                     <pic:cNvPicPr>
                       <a:picLocks noChangeArrowheads="1" noChangeAspect="1"/>
                     </pic:cNvPicPr>
                   </pic:nvPicPr>
                   <pic:blipFill>
                     <a:blip r:embed="rId25"/>
+                    <a:stretch>
+                      <a:fillRect/>
+                    </a:stretch>
+                  </pic:blipFill>
+                  <pic:spPr bwMode="auto">
+                    <a:xfrm>
+                      <a:off x="0" y="0"/>
+                      <a:ext cx="5334000" cy="1718532"/>
+                    </a:xfrm>
+                    <a:prstGeom prst="rect">
+                      <a:avLst/>
+                    </a:prstGeom>
+                    <a:noFill/>
+                    <a:ln w="9525">
+                      <a:noFill/>
+                      <a:headEnd/>
+                      <a:tailEnd/>
+                    </a:ln>
+                  </pic:spPr>
+                </pic:pic>
+              </a:graphicData>
+            </a:graphic>
+          </wp:inline>
+        </w:drawing>
+      </w:r>
+    </w:p>
+    <w:p>
+      <w:pPr>
+        <w:pStyle w:val="ImageCaption"/>
+      </w:pPr>
+      <w:r>
+        <w:t xml:space="preserve">Fig. 3 (monthly trend)</w:t>
+      </w:r>
+    </w:p>
+    <w:p>
+      <w:pPr>
+        <w:pStyle w:val="BodyText"/>
+      </w:pPr>
+      <w:r>
+        <w:rPr>
+          <w:b/>
+          <w:bCs/>
+        </w:rPr>
+        <w:t xml:space="preserve">Fig. 3 (monthly trend).</w:t>
+      </w:r>
+      <w:r>
+        <w:t xml:space="preserve"> </w:t>
+      </w:r>
+      <w:r>
+        <w:t xml:space="preserve">Monthly domain-mean 2 m temperature, 1990–1999. Each point is the area-averaged temperature for one calendar month (120 points total, Jan 1990 → Dec 1999), revealing year-to-year variability within each season. The warm bias of CMIP6 CESM2-WACCM (~1–2°C) persists throughout the decade. Data: ERA5-Land T2M and CMIP6 TAS, 24–38°N, 30–38°E.</w:t>
+      </w:r>
+    </w:p>
+    <w:p>
+      <w:pPr>
+        <w:pStyle w:val="CaptionedFigure"/>
+      </w:pPr>
+      <w:r>
+        <w:drawing>
+          <wp:inline>
+            <wp:extent cx="5334000" cy="2340761"/>
+            <wp:effectExtent b="0" l="0" r="0" t="0"/>
+            <wp:docPr descr="Fig. 3b" title="" id="29" name="Picture"/>
+            <a:graphic>
+              <a:graphicData uri="http://schemas.openxmlformats.org/drawingml/2006/picture">
+                <pic:pic>
+                  <pic:nvPicPr>
+                    <pic:cNvPr descr="plots/fig03b_monthly_climatology.png" id="30" name="Picture"/>
+                    <pic:cNvPicPr>
+                      <a:picLocks noChangeArrowheads="1" noChangeAspect="1"/>
+                    </pic:cNvPicPr>
+                  </pic:nvPicPr>
+                  <pic:blipFill>
+                    <a:blip r:embed="rId28"/>
                     <a:stretch>
                       <a:fillRect/>
                     </a:stretch>
@@ -1233,8 +1585,8 @@
         <w:t xml:space="preserve">Monthly mean 2 m temperature climatology, 1990–1999. Each point represents the multi-year mean for that calendar month. Data: ERA5-Land T2M and CMIP6 CESM2-WACCM TAS, 24–38°N, 30–38°E.</w:t>
       </w:r>
     </w:p>
-    <w:bookmarkEnd w:id="28"/>
-    <w:bookmarkStart w:id="32" w:name="spatial-variation"/>
+    <w:bookmarkEnd w:id="31"/>
+    <w:bookmarkStart w:id="35" w:name="spatial-variation"/>
     <w:p>
       <w:pPr>
         <w:pStyle w:val="Heading3"/>
@@ -1260,18 +1612,18 @@
           <wp:inline>
             <wp:extent cx="5334000" cy="5513097"/>
             <wp:effectExtent b="0" l="0" r="0" t="0"/>
-            <wp:docPr descr="Fig. 2" title="" id="30" name="Picture"/>
+            <wp:docPr descr="Fig. 2" title="" id="33" name="Picture"/>
             <a:graphic>
               <a:graphicData uri="http://schemas.openxmlformats.org/drawingml/2006/picture">
                 <pic:pic>
                   <pic:nvPicPr>
-                    <pic:cNvPr descr="plots/fig02_temperature_climatology_comparison.png" id="31" name="Picture"/>
+                    <pic:cNvPr descr="plots/fig02_temperature_climatology_comparison.png" id="34" name="Picture"/>
                     <pic:cNvPicPr>
                       <a:picLocks noChangeArrowheads="1" noChangeAspect="1"/>
                     </pic:cNvPicPr>
                   </pic:nvPicPr>
                   <pic:blipFill>
-                    <a:blip r:embed="rId29"/>
+                    <a:blip r:embed="rId32"/>
                     <a:stretch>
                       <a:fillRect/>
                     </a:stretch>
@@ -1324,8 +1676,8 @@
         <w:t xml:space="preserve">Mean 2 m temperature climatology, 1990–1999. Panel (a): ERA5-Land reanalysis at 0.1° resolution. Panel (b): CMIP6 CESM2-WACCM historical simulation at ~1° resolution. Both panels share the same colour scale. Data: ERA5-Land T2M and CMIP6 TAS, 24–38°N, 30–38°E.</w:t>
       </w:r>
     </w:p>
-    <w:bookmarkEnd w:id="32"/>
-    <w:bookmarkStart w:id="36" w:name="seasonal-patterns"/>
+    <w:bookmarkEnd w:id="35"/>
+    <w:bookmarkStart w:id="39" w:name="seasonal-patterns"/>
     <w:p>
       <w:pPr>
         <w:pStyle w:val="Heading3"/>
@@ -1351,18 +1703,18 @@
           <wp:inline>
             <wp:extent cx="5334000" cy="20160664"/>
             <wp:effectExtent b="0" l="0" r="0" t="0"/>
-            <wp:docPr descr="Fig. 4" title="" id="34" name="Picture"/>
+            <wp:docPr descr="Fig. 4" title="" id="37" name="Picture"/>
             <a:graphic>
               <a:graphicData uri="http://schemas.openxmlformats.org/drawingml/2006/picture">
                 <pic:pic>
                   <pic:nvPicPr>
-                    <pic:cNvPr descr="plots/fig04_seasonal_comparison.png" id="35" name="Picture"/>
+                    <pic:cNvPr descr="plots/fig04_seasonal_comparison.png" id="38" name="Picture"/>
                     <pic:cNvPicPr>
                       <a:picLocks noChangeArrowheads="1" noChangeAspect="1"/>
                     </pic:cNvPicPr>
                   </pic:nvPicPr>
                   <pic:blipFill>
-                    <a:blip r:embed="rId33"/>
+                    <a:blip r:embed="rId36"/>
                     <a:stretch>
                       <a:fillRect/>
                     </a:stretch>
@@ -1415,8 +1767,8 @@
         <w:t xml:space="preserve">Seasonal mean 2 m temperature climatology, 1990–1999. Each row shows one meteorological season (DJF, MAM, JJA, SON). Left column: ERA5-Land at 0.1° resolution. Right column: CMIP6 CESM2-WACCM at ~1° resolution. All panels share the same colour scale. Data: ERA5-Land T2M and CMIP6 TAS, 24–38°N, 30–38°E.</w:t>
       </w:r>
     </w:p>
-    <w:bookmarkEnd w:id="36"/>
-    <w:bookmarkStart w:id="40" w:name="temperature-distribution"/>
+    <w:bookmarkEnd w:id="39"/>
+    <w:bookmarkStart w:id="43" w:name="temperature-distribution"/>
     <w:p>
       <w:pPr>
         <w:pStyle w:val="Heading3"/>
@@ -1442,18 +1794,18 @@
           <wp:inline>
             <wp:extent cx="4608759" cy="5330170"/>
             <wp:effectExtent b="0" l="0" r="0" t="0"/>
-            <wp:docPr descr="Fig. 5" title="" id="38" name="Picture"/>
+            <wp:docPr descr="Fig. 5" title="" id="41" name="Picture"/>
             <a:graphic>
               <a:graphicData uri="http://schemas.openxmlformats.org/drawingml/2006/picture">
                 <pic:pic>
                   <pic:nvPicPr>
-                    <pic:cNvPr descr="plots/fig05_temperature_distributions.png" id="39" name="Picture"/>
+                    <pic:cNvPr descr="plots/fig05_temperature_distributions.png" id="42" name="Picture"/>
                     <pic:cNvPicPr>
                       <a:picLocks noChangeArrowheads="1" noChangeAspect="1"/>
                     </pic:cNvPicPr>
                   </pic:nvPicPr>
                   <pic:blipFill>
-                    <a:blip r:embed="rId37"/>
+                    <a:blip r:embed="rId40"/>
                     <a:stretch>
                       <a:fillRect/>
                     </a:stretch>
@@ -1506,8 +1858,8 @@
         <w:t xml:space="preserve">Distribution of daily 2 m temperature values, 1990–1999. Boxplots show the full distribution across all land pixels and all days for ERA5-Land (0.1°) and CMIP6 CESM2-WACCM (~1°). Box edges: 25th and 75th percentiles; whiskers: 1.5 × IQR; points: outliers. Data: ERA5-Land T2M and CMIP6 TAS, 24–38°N, 30–38°E.</w:t>
       </w:r>
     </w:p>
-    <w:bookmarkEnd w:id="40"/>
-    <w:bookmarkStart w:id="50" w:name="warming-trends"/>
+    <w:bookmarkEnd w:id="43"/>
+    <w:bookmarkStart w:id="53" w:name="warming-trends"/>
     <w:p>
       <w:pPr>
         <w:pStyle w:val="Heading3"/>
@@ -1569,135 +1921,12 @@
           <wp:inline>
             <wp:extent cx="5334000" cy="2068285"/>
             <wp:effectExtent b="0" l="0" r="0" t="0"/>
-            <wp:docPr descr="Fig. 10a" title="" id="42" name="Picture"/>
+            <wp:docPr descr="Fig. 10a" title="" id="45" name="Picture"/>
             <a:graphic>
               <a:graphicData uri="http://schemas.openxmlformats.org/drawingml/2006/picture">
                 <pic:pic>
                   <pic:nvPicPr>
-                    <pic:cNvPr descr="plots/fig10a_aug1_domain.png" id="43" name="Picture"/>
-                    <pic:cNvPicPr>
-                      <a:picLocks noChangeArrowheads="1" noChangeAspect="1"/>
-                    </pic:cNvPicPr>
-                  </pic:nvPicPr>
-                  <pic:blipFill>
-                    <a:blip r:embed="rId41"/>
-                    <a:stretch>
-                      <a:fillRect/>
-                    </a:stretch>
-                  </pic:blipFill>
-                  <pic:spPr bwMode="auto">
-                    <a:xfrm>
-                      <a:off x="0" y="0"/>
-                      <a:ext cx="5334000" cy="2068285"/>
-                    </a:xfrm>
-                    <a:prstGeom prst="rect">
-                      <a:avLst/>
-                    </a:prstGeom>
-                    <a:noFill/>
-                    <a:ln w="9525">
-                      <a:noFill/>
-                      <a:headEnd/>
-                      <a:tailEnd/>
-                    </a:ln>
-                  </pic:spPr>
-                </pic:pic>
-              </a:graphicData>
-            </a:graphic>
-          </wp:inline>
-        </w:drawing>
-      </w:r>
-    </w:p>
-    <w:p>
-      <w:pPr>
-        <w:pStyle w:val="ImageCaption"/>
-      </w:pPr>
-      <w:r>
-        <w:t xml:space="preserve">Fig. 10a</w:t>
-      </w:r>
-    </w:p>
-    <w:p>
-      <w:pPr>
-        <w:pStyle w:val="BodyText"/>
-      </w:pPr>
-      <w:r>
-        <w:rPr>
-          <w:b/>
-          <w:bCs/>
-        </w:rPr>
-        <w:t xml:space="preserve">Fig. 10a.</w:t>
-      </w:r>
-      <w:r>
-        <w:t xml:space="preserve"> </w:t>
-      </w:r>
-      <w:r>
-        <w:t xml:space="preserve">ERA5-Land and CMIP6 domain-wide minimum and maximum 2 m temperature on 1 August, 1990–1999. The shaded bands show the domain temperature range for each dataset. No consistent monotonic trend is visible across the ten years. Data: ERA5-Land T2M and CMIP6 TAS, 24–38°N, 30–38°E.</w:t>
-      </w:r>
-    </w:p>
-    <w:p>
-      <w:pPr>
-        <w:pStyle w:val="BodyText"/>
-      </w:pPr>
-      <w:r>
-        <w:rPr>
-          <w:b/>
-          <w:bCs/>
-        </w:rPr>
-        <w:t xml:space="preserve">Step 3 — Single pixel and single date (trend becomes discernible).</w:t>
-      </w:r>
-      <w:r>
-        <w:t xml:space="preserve"> </w:t>
-      </w:r>
-      <w:r>
-        <w:t xml:space="preserve">To further reduce noise, temperature was extracted from a single ERA5-Land pixel and its paired CMIP6 cell — the grid point closest to 35°E, 32°N (central Levant) — on 1 August of each year (Fig. 10b). At this point-scale, inter-annual noise is substantially lower than for the full domain. A linear OLS fit yields a positive trend of</w:t>
-      </w:r>
-      <w:r>
-        <w:t xml:space="preserve"> </w:t>
-      </w:r>
-      <w:r>
-        <w:rPr>
-          <w:b/>
-          <w:bCs/>
-        </w:rPr>
-        <w:t xml:space="preserve">+0.217 °C yr⁻¹</w:t>
-      </w:r>
-      <w:r>
-        <w:t xml:space="preserve"> </w:t>
-      </w:r>
-      <w:r>
-        <w:t xml:space="preserve">for ERA5-Land and</w:t>
-      </w:r>
-      <w:r>
-        <w:t xml:space="preserve"> </w:t>
-      </w:r>
-      <w:r>
-        <w:rPr>
-          <w:b/>
-          <w:bCs/>
-        </w:rPr>
-        <w:t xml:space="preserve">+0.121 °C yr⁻¹</w:t>
-      </w:r>
-      <w:r>
-        <w:t xml:space="preserve"> </w:t>
-      </w:r>
-      <w:r>
-        <w:t xml:space="preserve">for CMIP6 at this location over the decade. These values should be interpreted with caution: the 10-year record is too short to distinguish a forced trend from low-frequency natural variability, and a single pixel is subject to local noise not present in spatially averaged data.</w:t>
-      </w:r>
-    </w:p>
-    <w:p>
-      <w:pPr>
-        <w:pStyle w:val="CaptionedFigure"/>
-      </w:pPr>
-      <w:r>
-        <w:drawing>
-          <wp:inline>
-            <wp:extent cx="5334000" cy="2068285"/>
-            <wp:effectExtent b="0" l="0" r="0" t="0"/>
-            <wp:docPr descr="Fig. 10b" title="" id="45" name="Picture"/>
-            <a:graphic>
-              <a:graphicData uri="http://schemas.openxmlformats.org/drawingml/2006/picture">
-                <pic:pic>
-                  <pic:nvPicPr>
-                    <pic:cNvPr descr="plots/fig10b_aug1_pixel.png" id="46" name="Picture"/>
+                    <pic:cNvPr descr="plots/fig10a_aug1_domain.png" id="46" name="Picture"/>
                     <pic:cNvPicPr>
                       <a:picLocks noChangeArrowheads="1" noChangeAspect="1"/>
                     </pic:cNvPicPr>
@@ -1735,7 +1964,7 @@
         <w:pStyle w:val="ImageCaption"/>
       </w:pPr>
       <w:r>
-        <w:t xml:space="preserve">Fig. 10b</w:t>
+        <w:t xml:space="preserve">Fig. 10a</w:t>
       </w:r>
     </w:p>
     <w:p>
@@ -1747,13 +1976,13 @@
           <w:b/>
           <w:bCs/>
         </w:rPr>
-        <w:t xml:space="preserve">Fig. 10b.</w:t>
-      </w:r>
-      <w:r>
-        <w:t xml:space="preserve"> </w:t>
-      </w:r>
-      <w:r>
-        <w:t xml:space="preserve">2 m temperature on 1 August at the ERA5-Land pixel and CMIP6 cell nearest to 35°E, 32°N, 1990–1999. Dotted lines show OLS linear trend fits (ERA5-Land: +0.217 °C yr⁻¹; CMIP6: +0.121 °C yr⁻¹). Data: ERA5-Land T2M and CMIP6 TAS.</w:t>
+        <w:t xml:space="preserve">Fig. 10a.</w:t>
+      </w:r>
+      <w:r>
+        <w:t xml:space="preserve"> </w:t>
+      </w:r>
+      <w:r>
+        <w:t xml:space="preserve">ERA5-Land and CMIP6 domain-wide minimum and maximum 2 m temperature on 1 August, 1990–1999. The shaded bands show the domain temperature range for each dataset. No consistent monotonic trend is visible across the ten years. Data: ERA5-Land T2M and CMIP6 TAS, 24–38°N, 30–38°E.</w:t>
       </w:r>
     </w:p>
     <w:p>
@@ -1765,13 +1994,45 @@
           <w:b/>
           <w:bCs/>
         </w:rPr>
-        <w:t xml:space="preserve">Step 4 — Quarterly means at the representative location.</w:t>
-      </w:r>
-      <w:r>
-        <w:t xml:space="preserve"> </w:t>
-      </w:r>
-      <w:r>
-        <w:t xml:space="preserve">To obtain a more robust (less noisy) view of intra-decadal variability, quarterly (seasonal) mean temperatures were computed at the same location for each of the four meteorological seasons (Fig. 10). Seasonal means aggregate ~90 days per quarter, substantially reducing day-to-day noise relative to the single-date approach. The resulting time series confirm the general agreement between ERA5-Land and CMIP6 in terms of inter-annual variability, with CMIP6 exhibiting a systematic warm bias of ~1–2°C that is broadly constant across seasons and years. No season shows a statistically significant monotonic trend over the 10-year period, consistent with the domain-level analysis.</w:t>
+        <w:t xml:space="preserve">Step 3 — Single pixel and single date (trend becomes discernible).</w:t>
+      </w:r>
+      <w:r>
+        <w:t xml:space="preserve"> </w:t>
+      </w:r>
+      <w:r>
+        <w:t xml:space="preserve">To further reduce noise, temperature was extracted from a single ERA5-Land pixel and its paired CMIP6 cell — the grid point closest to 35°E, 32°N (central Levant) — on 1 August of each year (Fig. 10b). At this point-scale, inter-annual noise is substantially lower than for the full domain. A linear OLS fit yields a positive trend of</w:t>
+      </w:r>
+      <w:r>
+        <w:t xml:space="preserve"> </w:t>
+      </w:r>
+      <w:r>
+        <w:rPr>
+          <w:b/>
+          <w:bCs/>
+        </w:rPr>
+        <w:t xml:space="preserve">+0.217 °C yr⁻¹</w:t>
+      </w:r>
+      <w:r>
+        <w:t xml:space="preserve"> </w:t>
+      </w:r>
+      <w:r>
+        <w:t xml:space="preserve">for ERA5-Land and</w:t>
+      </w:r>
+      <w:r>
+        <w:t xml:space="preserve"> </w:t>
+      </w:r>
+      <w:r>
+        <w:rPr>
+          <w:b/>
+          <w:bCs/>
+        </w:rPr>
+        <w:t xml:space="preserve">+0.121 °C yr⁻¹</w:t>
+      </w:r>
+      <w:r>
+        <w:t xml:space="preserve"> </w:t>
+      </w:r>
+      <w:r>
+        <w:t xml:space="preserve">for CMIP6 at this location over the decade. These values should be interpreted with caution: the 10-year record is too short to distinguish a forced trend from low-frequency natural variability, and a single pixel is subject to local noise not present in spatially averaged data.</w:t>
       </w:r>
     </w:p>
     <w:p>
@@ -1781,20 +2042,111 @@
       <w:r>
         <w:drawing>
           <wp:inline>
-            <wp:extent cx="5334000" cy="3384908"/>
+            <wp:extent cx="5334000" cy="2068285"/>
             <wp:effectExtent b="0" l="0" r="0" t="0"/>
-            <wp:docPr descr="Fig. 10" title="" id="48" name="Picture"/>
+            <wp:docPr descr="Fig. 10b" title="" id="48" name="Picture"/>
             <a:graphic>
               <a:graphicData uri="http://schemas.openxmlformats.org/drawingml/2006/picture">
                 <pic:pic>
                   <pic:nvPicPr>
-                    <pic:cNvPr descr="plots/fig10_quarterly_warming_trend.png" id="49" name="Picture"/>
+                    <pic:cNvPr descr="plots/fig10b_aug1_pixel.png" id="49" name="Picture"/>
                     <pic:cNvPicPr>
                       <a:picLocks noChangeArrowheads="1" noChangeAspect="1"/>
                     </pic:cNvPicPr>
                   </pic:nvPicPr>
                   <pic:blipFill>
                     <a:blip r:embed="rId47"/>
+                    <a:stretch>
+                      <a:fillRect/>
+                    </a:stretch>
+                  </pic:blipFill>
+                  <pic:spPr bwMode="auto">
+                    <a:xfrm>
+                      <a:off x="0" y="0"/>
+                      <a:ext cx="5334000" cy="2068285"/>
+                    </a:xfrm>
+                    <a:prstGeom prst="rect">
+                      <a:avLst/>
+                    </a:prstGeom>
+                    <a:noFill/>
+                    <a:ln w="9525">
+                      <a:noFill/>
+                      <a:headEnd/>
+                      <a:tailEnd/>
+                    </a:ln>
+                  </pic:spPr>
+                </pic:pic>
+              </a:graphicData>
+            </a:graphic>
+          </wp:inline>
+        </w:drawing>
+      </w:r>
+    </w:p>
+    <w:p>
+      <w:pPr>
+        <w:pStyle w:val="ImageCaption"/>
+      </w:pPr>
+      <w:r>
+        <w:t xml:space="preserve">Fig. 10b</w:t>
+      </w:r>
+    </w:p>
+    <w:p>
+      <w:pPr>
+        <w:pStyle w:val="BodyText"/>
+      </w:pPr>
+      <w:r>
+        <w:rPr>
+          <w:b/>
+          <w:bCs/>
+        </w:rPr>
+        <w:t xml:space="preserve">Fig. 10b.</w:t>
+      </w:r>
+      <w:r>
+        <w:t xml:space="preserve"> </w:t>
+      </w:r>
+      <w:r>
+        <w:t xml:space="preserve">2 m temperature on 1 August at the ERA5-Land pixel and CMIP6 cell nearest to 35°E, 32°N, 1990–1999. Dotted lines show OLS linear trend fits (ERA5-Land: +0.217 °C yr⁻¹; CMIP6: +0.121 °C yr⁻¹). Data: ERA5-Land T2M and CMIP6 TAS.</w:t>
+      </w:r>
+    </w:p>
+    <w:p>
+      <w:pPr>
+        <w:pStyle w:val="BodyText"/>
+      </w:pPr>
+      <w:r>
+        <w:rPr>
+          <w:b/>
+          <w:bCs/>
+        </w:rPr>
+        <w:t xml:space="preserve">Step 4 — Quarterly means at the representative location.</w:t>
+      </w:r>
+      <w:r>
+        <w:t xml:space="preserve"> </w:t>
+      </w:r>
+      <w:r>
+        <w:t xml:space="preserve">To obtain a more robust (less noisy) view of intra-decadal variability, quarterly (seasonal) mean temperatures were computed at the same location for each of the four meteorological seasons (Fig. 10). Seasonal means aggregate ~90 days per quarter, substantially reducing day-to-day noise relative to the single-date approach. The resulting time series confirm the general agreement between ERA5-Land and CMIP6 in terms of inter-annual variability, with CMIP6 exhibiting a systematic warm bias of ~1–2°C that is broadly constant across seasons and years. No season shows a statistically significant monotonic trend over the 10-year period, consistent with the domain-level analysis.</w:t>
+      </w:r>
+    </w:p>
+    <w:p>
+      <w:pPr>
+        <w:pStyle w:val="CaptionedFigure"/>
+      </w:pPr>
+      <w:r>
+        <w:drawing>
+          <wp:inline>
+            <wp:extent cx="5334000" cy="3384908"/>
+            <wp:effectExtent b="0" l="0" r="0" t="0"/>
+            <wp:docPr descr="Fig. 10" title="" id="51" name="Picture"/>
+            <a:graphic>
+              <a:graphicData uri="http://schemas.openxmlformats.org/drawingml/2006/picture">
+                <pic:pic>
+                  <pic:nvPicPr>
+                    <pic:cNvPr descr="plots/fig10_quarterly_warming_trend.png" id="52" name="Picture"/>
+                    <pic:cNvPicPr>
+                      <a:picLocks noChangeArrowheads="1" noChangeAspect="1"/>
+                    </pic:cNvPicPr>
+                  </pic:nvPicPr>
+                  <pic:blipFill>
+                    <a:blip r:embed="rId50"/>
                     <a:stretch>
                       <a:fillRect/>
                     </a:stretch>
@@ -1854,9 +2206,9 @@
         </w:pict>
       </w:r>
     </w:p>
-    <w:bookmarkEnd w:id="50"/>
-    <w:bookmarkEnd w:id="51"/>
-    <w:bookmarkStart w:id="57" w:name="pairing-mechanism"/>
+    <w:bookmarkEnd w:id="53"/>
+    <w:bookmarkEnd w:id="54"/>
+    <w:bookmarkStart w:id="60" w:name="pairing-mechanism"/>
     <w:p>
       <w:pPr>
         <w:pStyle w:val="Heading2"/>
@@ -1865,7 +2217,7 @@
         <w:t xml:space="preserve">6. Pairing Mechanism</w:t>
       </w:r>
     </w:p>
-    <w:bookmarkStart w:id="55" w:name="Xb36677fb3fe1709fefca644ed317d1693f1c825"/>
+    <w:bookmarkStart w:id="58" w:name="Xb36677fb3fe1709fefca644ed317d1693f1c825"/>
     <w:p>
       <w:pPr>
         <w:pStyle w:val="Heading3"/>
@@ -2167,18 +2519,18 @@
           <wp:inline>
             <wp:extent cx="5334000" cy="4462618"/>
             <wp:effectExtent b="0" l="0" r="0" t="0"/>
-            <wp:docPr descr="Fig. 6" title="" id="53" name="Picture"/>
+            <wp:docPr descr="Fig. 6" title="" id="56" name="Picture"/>
             <a:graphic>
               <a:graphicData uri="http://schemas.openxmlformats.org/drawingml/2006/picture">
                 <pic:pic>
                   <pic:nvPicPr>
-                    <pic:cNvPr descr="plots/fig06_pixels_per_cmip_cell.png" id="54" name="Picture"/>
+                    <pic:cNvPr descr="plots/fig06_pixels_per_cmip_cell.png" id="57" name="Picture"/>
                     <pic:cNvPicPr>
                       <a:picLocks noChangeArrowheads="1" noChangeAspect="1"/>
                     </pic:cNvPicPr>
                   </pic:nvPicPr>
                   <pic:blipFill>
-                    <a:blip r:embed="rId52"/>
+                    <a:blip r:embed="rId55"/>
                     <a:stretch>
                       <a:fillRect/>
                     </a:stretch>
@@ -2231,8 +2583,8 @@
         <w:t xml:space="preserve">Number of ERA5-Land (0.1°) land pixels assigned to each CMIP6 CESM2-WACCM grid cell by nearest-neighbour matching. Cells located entirely over land receive the greatest number of ERA5-Land pixels; coastal cells straddling the land–sea boundary receive the fewest. Data: ERA5-Land and CMIP6 CESM2-WACCM, study region 24–38°N, 30–38°E.</w:t>
       </w:r>
     </w:p>
-    <w:bookmarkEnd w:id="55"/>
-    <w:bookmarkStart w:id="56" w:name="cmip6-grid-padding"/>
+    <w:bookmarkEnd w:id="58"/>
+    <w:bookmarkStart w:id="59" w:name="cmip6-grid-padding"/>
     <w:p>
       <w:pPr>
         <w:pStyle w:val="Heading3"/>
@@ -2256,9 +2608,9 @@
         </w:pict>
       </w:r>
     </w:p>
-    <w:bookmarkEnd w:id="56"/>
-    <w:bookmarkEnd w:id="57"/>
-    <w:bookmarkStart w:id="73" w:name="coarsefine-temperature-relationship"/>
+    <w:bookmarkEnd w:id="59"/>
+    <w:bookmarkEnd w:id="60"/>
+    <w:bookmarkStart w:id="76" w:name="coarsefine-temperature-relationship"/>
     <w:p>
       <w:pPr>
         <w:pStyle w:val="Heading2"/>
@@ -2267,7 +2619,7 @@
         <w:t xml:space="preserve">7. Coarse–Fine Temperature Relationship</w:t>
       </w:r>
     </w:p>
-    <w:bookmarkStart w:id="61" w:name="linear-relationship"/>
+    <w:bookmarkStart w:id="64" w:name="linear-relationship"/>
     <w:p>
       <w:pPr>
         <w:pStyle w:val="Heading3"/>
@@ -2386,18 +2738,18 @@
           <wp:inline>
             <wp:extent cx="5334000" cy="2315147"/>
             <wp:effectExtent b="0" l="0" r="0" t="0"/>
-            <wp:docPr descr="Fig. 7" title="" id="59" name="Picture"/>
+            <wp:docPr descr="Fig. 7" title="" id="62" name="Picture"/>
             <a:graphic>
               <a:graphicData uri="http://schemas.openxmlformats.org/drawingml/2006/picture">
                 <pic:pic>
                   <pic:nvPicPr>
-                    <pic:cNvPr descr="plots/fig07_scatter_regression.png" id="60" name="Picture"/>
+                    <pic:cNvPr descr="plots/fig07_scatter_regression.png" id="63" name="Picture"/>
                     <pic:cNvPicPr>
                       <a:picLocks noChangeArrowheads="1" noChangeAspect="1"/>
                     </pic:cNvPicPr>
                   </pic:nvPicPr>
                   <pic:blipFill>
-                    <a:blip r:embed="rId58"/>
+                    <a:blip r:embed="rId61"/>
                     <a:stretch>
                       <a:fillRect/>
                     </a:stretch>
@@ -2466,8 +2818,8 @@
         <w:t xml:space="preserve">annotated). Data: ERA5-Land T2M and CMIP6 TAS, 24–38°N, 30–38°E.</w:t>
       </w:r>
     </w:p>
-    <w:bookmarkEnd w:id="61"/>
-    <w:bookmarkStart w:id="65" w:name="residual-diagnostics"/>
+    <w:bookmarkEnd w:id="64"/>
+    <w:bookmarkStart w:id="68" w:name="residual-diagnostics"/>
     <w:p>
       <w:pPr>
         <w:pStyle w:val="Heading3"/>
@@ -2493,18 +2845,18 @@
           <wp:inline>
             <wp:extent cx="5334000" cy="2284063"/>
             <wp:effectExtent b="0" l="0" r="0" t="0"/>
-            <wp:docPr descr="Fig. 8" title="" id="63" name="Picture"/>
+            <wp:docPr descr="Fig. 8" title="" id="66" name="Picture"/>
             <a:graphic>
               <a:graphicData uri="http://schemas.openxmlformats.org/drawingml/2006/picture">
                 <pic:pic>
                   <pic:nvPicPr>
-                    <pic:cNvPr descr="plots/fig08_residual_analysis.png" id="64" name="Picture"/>
+                    <pic:cNvPr descr="plots/fig08_residual_analysis.png" id="67" name="Picture"/>
                     <pic:cNvPicPr>
                       <a:picLocks noChangeArrowheads="1" noChangeAspect="1"/>
                     </pic:cNvPicPr>
                   </pic:nvPicPr>
                   <pic:blipFill>
-                    <a:blip r:embed="rId62"/>
+                    <a:blip r:embed="rId65"/>
                     <a:stretch>
                       <a:fillRect/>
                     </a:stretch>
@@ -2557,8 +2909,8 @@
         <w:t xml:space="preserve">OLS residual diagnostics, 1990–1999. Panel (a): residuals versus CMIP6 TAS value; a horizontal band near zero indicates homoscedasticity. Panel (b): residuals versus Euclidean distance from the assigned CMIP6 cell centre in degrees; a non-zero slope would indicate boundary-assignment artefacts. Data: ERA5-Land T2M and CMIP6 TAS, 24–38°N, 30–38°E.</w:t>
       </w:r>
     </w:p>
-    <w:bookmarkEnd w:id="65"/>
-    <w:bookmarkStart w:id="72" w:name="Xcc6ba20f731b5af548538617341ce41f8bcf6f1"/>
+    <w:bookmarkEnd w:id="68"/>
+    <w:bookmarkStart w:id="75" w:name="Xcc6ba20f731b5af548538617341ce41f8bcf6f1"/>
     <w:p>
       <w:pPr>
         <w:pStyle w:val="Heading3"/>
@@ -2594,85 +2946,12 @@
           <wp:inline>
             <wp:extent cx="5334000" cy="2901478"/>
             <wp:effectExtent b="0" l="0" r="0" t="0"/>
-            <wp:docPr descr="Fig. 11" title="" id="67" name="Picture"/>
+            <wp:docPr descr="Fig. 11" title="" id="70" name="Picture"/>
             <a:graphic>
               <a:graphicData uri="http://schemas.openxmlformats.org/drawingml/2006/picture">
                 <pic:pic>
                   <pic:nvPicPr>
-                    <pic:cNvPr descr="plots/fig11_residuals_by_sea_fraction.png" id="68" name="Picture"/>
-                    <pic:cNvPicPr>
-                      <a:picLocks noChangeArrowheads="1" noChangeAspect="1"/>
-                    </pic:cNvPicPr>
-                  </pic:nvPicPr>
-                  <pic:blipFill>
-                    <a:blip r:embed="rId66"/>
-                    <a:stretch>
-                      <a:fillRect/>
-                    </a:stretch>
-                  </pic:blipFill>
-                  <pic:spPr bwMode="auto">
-                    <a:xfrm>
-                      <a:off x="0" y="0"/>
-                      <a:ext cx="5334000" cy="2901478"/>
-                    </a:xfrm>
-                    <a:prstGeom prst="rect">
-                      <a:avLst/>
-                    </a:prstGeom>
-                    <a:noFill/>
-                    <a:ln w="9525">
-                      <a:noFill/>
-                      <a:headEnd/>
-                      <a:tailEnd/>
-                    </a:ln>
-                  </pic:spPr>
-                </pic:pic>
-              </a:graphicData>
-            </a:graphic>
-          </wp:inline>
-        </w:drawing>
-      </w:r>
-    </w:p>
-    <w:p>
-      <w:pPr>
-        <w:pStyle w:val="ImageCaption"/>
-      </w:pPr>
-      <w:r>
-        <w:t xml:space="preserve">Fig. 11</w:t>
-      </w:r>
-    </w:p>
-    <w:p>
-      <w:pPr>
-        <w:pStyle w:val="BodyText"/>
-      </w:pPr>
-      <w:r>
-        <w:rPr>
-          <w:b/>
-          <w:bCs/>
-        </w:rPr>
-        <w:t xml:space="preserve">Fig. 11.</w:t>
-      </w:r>
-      <w:r>
-        <w:t xml:space="preserve"> </w:t>
-      </w:r>
-      <w:r>
-        <w:t xml:space="preserve">OLS residual distribution by CMIP6 cell sea fraction, 1990–1999. Each box summarises all pixel×day residuals for CMIP6 cells within a given sea-fraction bin (20% intervals). Data: ERA5-Land T2M and CMIP6 TAS, 24–38°N, 30–38°E.</w:t>
-      </w:r>
-    </w:p>
-    <w:p>
-      <w:pPr>
-        <w:pStyle w:val="CaptionedFigure"/>
-      </w:pPr>
-      <w:r>
-        <w:drawing>
-          <wp:inline>
-            <wp:extent cx="5334000" cy="2901478"/>
-            <wp:effectExtent b="0" l="0" r="0" t="0"/>
-            <wp:docPr descr="Fig. 12" title="" id="70" name="Picture"/>
-            <a:graphic>
-              <a:graphicData uri="http://schemas.openxmlformats.org/drawingml/2006/picture">
-                <pic:pic>
-                  <pic:nvPicPr>
-                    <pic:cNvPr descr="plots/fig12_residuals_by_pixel_count.png" id="71" name="Picture"/>
+                    <pic:cNvPr descr="plots/fig11_residuals_by_sea_fraction.png" id="71" name="Picture"/>
                     <pic:cNvPicPr>
                       <a:picLocks noChangeArrowheads="1" noChangeAspect="1"/>
                     </pic:cNvPicPr>
@@ -2710,7 +2989,7 @@
         <w:pStyle w:val="ImageCaption"/>
       </w:pPr>
       <w:r>
-        <w:t xml:space="preserve">Fig. 12</w:t>
+        <w:t xml:space="preserve">Fig. 11</w:t>
       </w:r>
     </w:p>
     <w:p>
@@ -2722,57 +3001,13 @@
           <w:b/>
           <w:bCs/>
         </w:rPr>
-        <w:t xml:space="preserve">Fig. 12.</w:t>
-      </w:r>
-      <w:r>
-        <w:t xml:space="preserve"> </w:t>
-      </w:r>
-      <w:r>
-        <w:t xml:space="preserve">OLS residual distribution by CMIP6 cell land-pixel count, 1990–1999. Each box summarises all pixel×day residuals for CMIP6 cells within a given pixel-count quantile bin. Data: ERA5-Land T2M and CMIP6 TAS, 24–38°N, 30–38°E.</w:t>
-      </w:r>
-    </w:p>
-    <w:p>
-      <w:r>
-        <w:pict>
-          <v:rect style="width:0;height:1.5pt" o:hralign="center" o:hrstd="t" o:hr="t"/>
-        </w:pict>
-      </w:r>
-    </w:p>
-    <w:bookmarkEnd w:id="72"/>
-    <w:bookmarkEnd w:id="73"/>
-    <w:bookmarkStart w:id="77" w:name="feature-engineering-work-in-progress"/>
-    <w:p>
-      <w:pPr>
-        <w:pStyle w:val="Heading2"/>
-      </w:pPr>
-      <w:r>
-        <w:t xml:space="preserve">8. Feature Engineering</w:t>
-      </w:r>
-      <w:r>
-        <w:t xml:space="preserve"> </w:t>
-      </w:r>
-      <w:r>
-        <w:rPr>
-          <w:i/>
-          <w:iCs/>
-        </w:rPr>
-        <w:t xml:space="preserve">(work in progress)</w:t>
-      </w:r>
-    </w:p>
-    <w:p>
-      <w:pPr>
-        <w:pStyle w:val="FirstParagraph"/>
-      </w:pPr>
-      <w:r>
-        <w:t xml:space="preserve">As proposed by Dorita Morin, the area-weighted global mean daily TAS from the CMIP6 model (computed over all grid cells worldwide) provides a large-scale thermodynamic predictor. This global signal encodes the overall state of the climate system on each day and may improve downscaling performance beyond the local cell temperature alone by capturing the background warming state.</w:t>
-      </w:r>
-    </w:p>
-    <w:p>
-      <w:pPr>
-        <w:pStyle w:val="BodyText"/>
-      </w:pPr>
-      <w:r>
-        <w:t xml:space="preserve">Fig. 9 shows the global mean TAS time series for 1990–1999. The seasonal cycle is clearly visible, and the global mean is substantially lower (~14°C) than the EMME regional mean (~20.5°C), as expected for a global average that includes polar regions.</w:t>
+        <w:t xml:space="preserve">Fig. 11.</w:t>
+      </w:r>
+      <w:r>
+        <w:t xml:space="preserve"> </w:t>
+      </w:r>
+      <w:r>
+        <w:t xml:space="preserve">OLS residual distribution by CMIP6 cell sea fraction, 1990–1999. Each box summarises all pixel×day residuals for CMIP6 cells within a given sea-fraction bin (20% intervals). Data: ERA5-Land T2M and CMIP6 TAS, 24–38°N, 30–38°E.</w:t>
       </w:r>
     </w:p>
     <w:p>
@@ -2782,20 +3017,137 @@
       <w:r>
         <w:drawing>
           <wp:inline>
-            <wp:extent cx="5334000" cy="1718532"/>
+            <wp:extent cx="5334000" cy="2901478"/>
             <wp:effectExtent b="0" l="0" r="0" t="0"/>
-            <wp:docPr descr="Fig. 9" title="" id="75" name="Picture"/>
+            <wp:docPr descr="Fig. 12" title="" id="73" name="Picture"/>
             <a:graphic>
               <a:graphicData uri="http://schemas.openxmlformats.org/drawingml/2006/picture">
                 <pic:pic>
                   <pic:nvPicPr>
-                    <pic:cNvPr descr="plots/fig09_global_mean_tas.png" id="76" name="Picture"/>
+                    <pic:cNvPr descr="plots/fig12_residuals_by_pixel_count.png" id="74" name="Picture"/>
                     <pic:cNvPicPr>
                       <a:picLocks noChangeArrowheads="1" noChangeAspect="1"/>
                     </pic:cNvPicPr>
                   </pic:nvPicPr>
                   <pic:blipFill>
-                    <a:blip r:embed="rId74"/>
+                    <a:blip r:embed="rId72"/>
+                    <a:stretch>
+                      <a:fillRect/>
+                    </a:stretch>
+                  </pic:blipFill>
+                  <pic:spPr bwMode="auto">
+                    <a:xfrm>
+                      <a:off x="0" y="0"/>
+                      <a:ext cx="5334000" cy="2901478"/>
+                    </a:xfrm>
+                    <a:prstGeom prst="rect">
+                      <a:avLst/>
+                    </a:prstGeom>
+                    <a:noFill/>
+                    <a:ln w="9525">
+                      <a:noFill/>
+                      <a:headEnd/>
+                      <a:tailEnd/>
+                    </a:ln>
+                  </pic:spPr>
+                </pic:pic>
+              </a:graphicData>
+            </a:graphic>
+          </wp:inline>
+        </w:drawing>
+      </w:r>
+    </w:p>
+    <w:p>
+      <w:pPr>
+        <w:pStyle w:val="ImageCaption"/>
+      </w:pPr>
+      <w:r>
+        <w:t xml:space="preserve">Fig. 12</w:t>
+      </w:r>
+    </w:p>
+    <w:p>
+      <w:pPr>
+        <w:pStyle w:val="BodyText"/>
+      </w:pPr>
+      <w:r>
+        <w:rPr>
+          <w:b/>
+          <w:bCs/>
+        </w:rPr>
+        <w:t xml:space="preserve">Fig. 12.</w:t>
+      </w:r>
+      <w:r>
+        <w:t xml:space="preserve"> </w:t>
+      </w:r>
+      <w:r>
+        <w:t xml:space="preserve">OLS residual distribution by CMIP6 cell land-pixel count, 1990–1999. Each box summarises all pixel×day residuals for CMIP6 cells within a given pixel-count quantile bin. Data: ERA5-Land T2M and CMIP6 TAS, 24–38°N, 30–38°E.</w:t>
+      </w:r>
+    </w:p>
+    <w:p>
+      <w:r>
+        <w:pict>
+          <v:rect style="width:0;height:1.5pt" o:hralign="center" o:hrstd="t" o:hr="t"/>
+        </w:pict>
+      </w:r>
+    </w:p>
+    <w:bookmarkEnd w:id="75"/>
+    <w:bookmarkEnd w:id="76"/>
+    <w:bookmarkStart w:id="80" w:name="feature-engineering-work-in-progress"/>
+    <w:p>
+      <w:pPr>
+        <w:pStyle w:val="Heading2"/>
+      </w:pPr>
+      <w:r>
+        <w:t xml:space="preserve">8. Feature Engineering</w:t>
+      </w:r>
+      <w:r>
+        <w:t xml:space="preserve"> </w:t>
+      </w:r>
+      <w:r>
+        <w:rPr>
+          <w:i/>
+          <w:iCs/>
+        </w:rPr>
+        <w:t xml:space="preserve">(work in progress)</w:t>
+      </w:r>
+    </w:p>
+    <w:p>
+      <w:pPr>
+        <w:pStyle w:val="FirstParagraph"/>
+      </w:pPr>
+      <w:r>
+        <w:t xml:space="preserve">As proposed by Dorita Morin, the area-weighted global mean daily TAS from the CMIP6 model (computed over all grid cells worldwide) provides a large-scale thermodynamic predictor. This global signal encodes the overall state of the climate system on each day and may improve downscaling performance beyond the local cell temperature alone by capturing the background warming state.</w:t>
+      </w:r>
+    </w:p>
+    <w:p>
+      <w:pPr>
+        <w:pStyle w:val="BodyText"/>
+      </w:pPr>
+      <w:r>
+        <w:t xml:space="preserve">Fig. 9 shows the global mean TAS time series for 1990–1999. The seasonal cycle is clearly visible, and the global mean is substantially lower (~14°C) than the EMME regional mean (~20.5°C), as expected for a global average that includes polar regions.</w:t>
+      </w:r>
+    </w:p>
+    <w:p>
+      <w:pPr>
+        <w:pStyle w:val="CaptionedFigure"/>
+      </w:pPr>
+      <w:r>
+        <w:drawing>
+          <wp:inline>
+            <wp:extent cx="5334000" cy="1718532"/>
+            <wp:effectExtent b="0" l="0" r="0" t="0"/>
+            <wp:docPr descr="Fig. 9" title="" id="78" name="Picture"/>
+            <a:graphic>
+              <a:graphicData uri="http://schemas.openxmlformats.org/drawingml/2006/picture">
+                <pic:pic>
+                  <pic:nvPicPr>
+                    <pic:cNvPr descr="plots/fig09_global_mean_tas.png" id="79" name="Picture"/>
+                    <pic:cNvPicPr>
+                      <a:picLocks noChangeArrowheads="1" noChangeAspect="1"/>
+                    </pic:cNvPicPr>
+                  </pic:nvPicPr>
+                  <pic:blipFill>
+                    <a:blip r:embed="rId77"/>
                     <a:stretch>
                       <a:fillRect/>
                     </a:stretch>
@@ -2855,8 +3207,8 @@
         </w:pict>
       </w:r>
     </w:p>
-    <w:bookmarkEnd w:id="77"/>
-    <w:bookmarkStart w:id="78" w:name="next-steps"/>
+    <w:bookmarkEnd w:id="80"/>
+    <w:bookmarkStart w:id="81" w:name="next-steps"/>
     <w:p>
       <w:pPr>
         <w:pStyle w:val="Heading2"/>
@@ -3006,8 +3358,8 @@
         <w:t xml:space="preserve">— Random forests, gradient boosting, and neural network architectures will be evaluated against the linear baseline using spatial RMSE, bias, and correlation maps.</w:t>
       </w:r>
     </w:p>
-    <w:bookmarkEnd w:id="78"/>
-    <w:bookmarkEnd w:id="79"/>
+    <w:bookmarkEnd w:id="81"/>
+    <w:bookmarkEnd w:id="82"/>
     <w:sectPr>
       <w:footnotePr>
         <w:numRestart w:val="eachSect"/>

</xml_diff>

<commit_message>
Add std deviation to Main Statistics summary
Co-Authored-By: Claude Sonnet 4.6 <noreply@anthropic.com>
</commit_message>
<xml_diff>
--- a/initial_findings.docx
+++ b/initial_findings.docx
@@ -949,6 +949,41 @@
             </w:pPr>
             <w:r>
               <w:t xml:space="preserve">20.8</w:t>
+            </w:r>
+          </w:p>
+        </w:tc>
+      </w:tr>
+      <w:tr>
+        <w:tc>
+          <w:tcPr/>
+          <w:p>
+            <w:pPr>
+              <w:pStyle w:val="Compact"/>
+            </w:pPr>
+            <w:r>
+              <w:t xml:space="preserve">Std deviation</w:t>
+            </w:r>
+          </w:p>
+        </w:tc>
+        <w:tc>
+          <w:tcPr/>
+          <w:p>
+            <w:pPr>
+              <w:pStyle w:val="Compact"/>
+            </w:pPr>
+            <w:r>
+              <w:t xml:space="preserve">8.7</w:t>
+            </w:r>
+          </w:p>
+        </w:tc>
+        <w:tc>
+          <w:tcPr/>
+          <w:p>
+            <w:pPr>
+              <w:pStyle w:val="Compact"/>
+            </w:pPr>
+            <w:r>
+              <w:t xml:space="preserve">7.9</w:t>
             </w:r>
           </w:p>
         </w:tc>

</xml_diff>

<commit_message>
Add annual mean timeseries (fig03c) under Domain-averaged temporal variation
Co-Authored-By: Claude Sonnet 4.6 <noreply@anthropic.com>
</commit_message>
<xml_diff>
--- a/initial_findings.docx
+++ b/initial_findings.docx
@@ -2,7 +2,7 @@
 <file path=word/document.xml><?xml version="1.0" encoding="utf-8"?>
 <w:document xmlns:w="http://schemas.openxmlformats.org/wordprocessingml/2006/main" xmlns:m="http://schemas.openxmlformats.org/officeDocument/2006/math" xmlns:r="http://schemas.openxmlformats.org/officeDocument/2006/relationships" xmlns:o="urn:schemas-microsoft-com:office:office" xmlns:v="urn:schemas-microsoft-com:vml" xmlns:w10="urn:schemas-microsoft-com:office:word" xmlns:a="http://schemas.openxmlformats.org/drawingml/2006/main" xmlns:pic="http://schemas.openxmlformats.org/drawingml/2006/picture" xmlns:wp="http://schemas.openxmlformats.org/drawingml/2006/wordprocessingDrawing">
   <w:body>
-    <w:bookmarkStart w:id="82" w:name="statistical-downscaling-initial-findings"/>
+    <w:bookmarkStart w:id="85" w:name="statistical-downscaling-initial-findings"/>
     <w:p>
       <w:pPr>
         <w:pStyle w:val="Heading1"/>
@@ -1367,7 +1367,7 @@
     </w:p>
     <w:bookmarkEnd w:id="20"/>
     <w:bookmarkEnd w:id="21"/>
-    <w:bookmarkStart w:id="54" w:name="exploratory-descriptive-analysis"/>
+    <w:bookmarkStart w:id="57" w:name="exploratory-descriptive-analysis"/>
     <w:p>
       <w:pPr>
         <w:pStyle w:val="Heading2"/>
@@ -1376,7 +1376,7 @@
         <w:t xml:space="preserve">5. Exploratory &amp; Descriptive Analysis</w:t>
       </w:r>
     </w:p>
-    <w:bookmarkStart w:id="31" w:name="temporal-variation"/>
+    <w:bookmarkStart w:id="34" w:name="temporal-variation"/>
     <w:p>
       <w:pPr>
         <w:pStyle w:val="Heading3"/>
@@ -1620,22 +1620,12 @@
         <w:t xml:space="preserve">Monthly mean 2 m temperature climatology, 1990–1999. Each point represents the multi-year mean for that calendar month. Data: ERA5-Land T2M and CMIP6 CESM2-WACCM TAS, 24–38°N, 30–38°E.</w:t>
       </w:r>
     </w:p>
-    <w:bookmarkEnd w:id="31"/>
-    <w:bookmarkStart w:id="35" w:name="spatial-variation"/>
-    <w:p>
-      <w:pPr>
-        <w:pStyle w:val="Heading3"/>
-      </w:pPr>
-      <w:r>
-        <w:t xml:space="preserve">5.2 Spatial variation</w:t>
-      </w:r>
-    </w:p>
-    <w:p>
-      <w:pPr>
-        <w:pStyle w:val="FirstParagraph"/>
-      </w:pPr>
-      <w:r>
-        <w:t xml:space="preserve">The mean 2 m temperature climatology (1990–1999) reveals a clear north–south thermal gradient (Fig. 2). The highest mean temperatures occur over the Arabian Peninsula (~35–40°C), and the lowest over the highlands of Turkey and the Levant (~5–15°C). Coastal and topographically complex areas exhibit pronounced spatial variability in ERA5-Land that is not resolved at the CMIP6 grid scale.</w:t>
+    <w:p>
+      <w:pPr>
+        <w:pStyle w:val="BodyText"/>
+      </w:pPr>
+      <w:r>
+        <w:t xml:space="preserve">Aggregating further to annual means (Fig. 3c) reduces each dataset to 10 data points and makes year-to-year variability directly visible without the masking effect of the seasonal cycle.</w:t>
       </w:r>
     </w:p>
     <w:p>
@@ -1645,20 +1635,111 @@
       <w:r>
         <w:drawing>
           <wp:inline>
-            <wp:extent cx="5334000" cy="5513097"/>
+            <wp:extent cx="5334000" cy="1718532"/>
             <wp:effectExtent b="0" l="0" r="0" t="0"/>
-            <wp:docPr descr="Fig. 2" title="" id="33" name="Picture"/>
+            <wp:docPr descr="Fig. 3c" title="" id="32" name="Picture"/>
             <a:graphic>
               <a:graphicData uri="http://schemas.openxmlformats.org/drawingml/2006/picture">
                 <pic:pic>
                   <pic:nvPicPr>
-                    <pic:cNvPr descr="plots/fig02_temperature_climatology_comparison.png" id="34" name="Picture"/>
+                    <pic:cNvPr descr="plots/fig03c_yearly_mean.png" id="33" name="Picture"/>
                     <pic:cNvPicPr>
                       <a:picLocks noChangeArrowheads="1" noChangeAspect="1"/>
                     </pic:cNvPicPr>
                   </pic:nvPicPr>
                   <pic:blipFill>
-                    <a:blip r:embed="rId32"/>
+                    <a:blip r:embed="rId31"/>
+                    <a:stretch>
+                      <a:fillRect/>
+                    </a:stretch>
+                  </pic:blipFill>
+                  <pic:spPr bwMode="auto">
+                    <a:xfrm>
+                      <a:off x="0" y="0"/>
+                      <a:ext cx="5334000" cy="1718532"/>
+                    </a:xfrm>
+                    <a:prstGeom prst="rect">
+                      <a:avLst/>
+                    </a:prstGeom>
+                    <a:noFill/>
+                    <a:ln w="9525">
+                      <a:noFill/>
+                      <a:headEnd/>
+                      <a:tailEnd/>
+                    </a:ln>
+                  </pic:spPr>
+                </pic:pic>
+              </a:graphicData>
+            </a:graphic>
+          </wp:inline>
+        </w:drawing>
+      </w:r>
+    </w:p>
+    <w:p>
+      <w:pPr>
+        <w:pStyle w:val="ImageCaption"/>
+      </w:pPr>
+      <w:r>
+        <w:t xml:space="preserve">Fig. 3c</w:t>
+      </w:r>
+    </w:p>
+    <w:p>
+      <w:pPr>
+        <w:pStyle w:val="BodyText"/>
+      </w:pPr>
+      <w:r>
+        <w:rPr>
+          <w:b/>
+          <w:bCs/>
+        </w:rPr>
+        <w:t xml:space="preserve">Fig. 3c.</w:t>
+      </w:r>
+      <w:r>
+        <w:t xml:space="preserve"> </w:t>
+      </w:r>
+      <w:r>
+        <w:t xml:space="preserve">Annual mean domain-averaged 2 m temperature, 1990–1999. Each point represents the area-averaged temperature for one calendar year, giving 10 data points per dataset. The CMIP6 CESM2-WACCM model is consistently warmer than ERA5-Land by approximately 1–2°C in every year of the record. Data: ERA5-Land T2M and CMIP6 TAS, 24–38°N, 30–38°E.</w:t>
+      </w:r>
+    </w:p>
+    <w:bookmarkEnd w:id="34"/>
+    <w:bookmarkStart w:id="38" w:name="spatial-variation"/>
+    <w:p>
+      <w:pPr>
+        <w:pStyle w:val="Heading3"/>
+      </w:pPr>
+      <w:r>
+        <w:t xml:space="preserve">5.2 Spatial variation</w:t>
+      </w:r>
+    </w:p>
+    <w:p>
+      <w:pPr>
+        <w:pStyle w:val="FirstParagraph"/>
+      </w:pPr>
+      <w:r>
+        <w:t xml:space="preserve">The mean 2 m temperature climatology (1990–1999) reveals a clear north–south thermal gradient (Fig. 2). The highest mean temperatures occur over the Arabian Peninsula (~35–40°C), and the lowest over the highlands of Turkey and the Levant (~5–15°C). Coastal and topographically complex areas exhibit pronounced spatial variability in ERA5-Land that is not resolved at the CMIP6 grid scale.</w:t>
+      </w:r>
+    </w:p>
+    <w:p>
+      <w:pPr>
+        <w:pStyle w:val="CaptionedFigure"/>
+      </w:pPr>
+      <w:r>
+        <w:drawing>
+          <wp:inline>
+            <wp:extent cx="5334000" cy="5513097"/>
+            <wp:effectExtent b="0" l="0" r="0" t="0"/>
+            <wp:docPr descr="Fig. 2" title="" id="36" name="Picture"/>
+            <a:graphic>
+              <a:graphicData uri="http://schemas.openxmlformats.org/drawingml/2006/picture">
+                <pic:pic>
+                  <pic:nvPicPr>
+                    <pic:cNvPr descr="plots/fig02_temperature_climatology_comparison.png" id="37" name="Picture"/>
+                    <pic:cNvPicPr>
+                      <a:picLocks noChangeArrowheads="1" noChangeAspect="1"/>
+                    </pic:cNvPicPr>
+                  </pic:nvPicPr>
+                  <pic:blipFill>
+                    <a:blip r:embed="rId35"/>
                     <a:stretch>
                       <a:fillRect/>
                     </a:stretch>
@@ -1711,8 +1792,8 @@
         <w:t xml:space="preserve">Mean 2 m temperature climatology, 1990–1999. Panel (a): ERA5-Land reanalysis at 0.1° resolution. Panel (b): CMIP6 CESM2-WACCM historical simulation at ~1° resolution. Both panels share the same colour scale. Data: ERA5-Land T2M and CMIP6 TAS, 24–38°N, 30–38°E.</w:t>
       </w:r>
     </w:p>
-    <w:bookmarkEnd w:id="35"/>
-    <w:bookmarkStart w:id="39" w:name="seasonal-patterns"/>
+    <w:bookmarkEnd w:id="38"/>
+    <w:bookmarkStart w:id="42" w:name="seasonal-patterns"/>
     <w:p>
       <w:pPr>
         <w:pStyle w:val="Heading3"/>
@@ -1738,18 +1819,18 @@
           <wp:inline>
             <wp:extent cx="5334000" cy="20160664"/>
             <wp:effectExtent b="0" l="0" r="0" t="0"/>
-            <wp:docPr descr="Fig. 4" title="" id="37" name="Picture"/>
+            <wp:docPr descr="Fig. 4" title="" id="40" name="Picture"/>
             <a:graphic>
               <a:graphicData uri="http://schemas.openxmlformats.org/drawingml/2006/picture">
                 <pic:pic>
                   <pic:nvPicPr>
-                    <pic:cNvPr descr="plots/fig04_seasonal_comparison.png" id="38" name="Picture"/>
+                    <pic:cNvPr descr="plots/fig04_seasonal_comparison.png" id="41" name="Picture"/>
                     <pic:cNvPicPr>
                       <a:picLocks noChangeArrowheads="1" noChangeAspect="1"/>
                     </pic:cNvPicPr>
                   </pic:nvPicPr>
                   <pic:blipFill>
-                    <a:blip r:embed="rId36"/>
+                    <a:blip r:embed="rId39"/>
                     <a:stretch>
                       <a:fillRect/>
                     </a:stretch>
@@ -1802,8 +1883,8 @@
         <w:t xml:space="preserve">Seasonal mean 2 m temperature climatology, 1990–1999. Each row shows one meteorological season (DJF, MAM, JJA, SON). Left column: ERA5-Land at 0.1° resolution. Right column: CMIP6 CESM2-WACCM at ~1° resolution. All panels share the same colour scale. Data: ERA5-Land T2M and CMIP6 TAS, 24–38°N, 30–38°E.</w:t>
       </w:r>
     </w:p>
-    <w:bookmarkEnd w:id="39"/>
-    <w:bookmarkStart w:id="43" w:name="temperature-distribution"/>
+    <w:bookmarkEnd w:id="42"/>
+    <w:bookmarkStart w:id="46" w:name="temperature-distribution"/>
     <w:p>
       <w:pPr>
         <w:pStyle w:val="Heading3"/>
@@ -1829,18 +1910,18 @@
           <wp:inline>
             <wp:extent cx="4608759" cy="5330170"/>
             <wp:effectExtent b="0" l="0" r="0" t="0"/>
-            <wp:docPr descr="Fig. 5" title="" id="41" name="Picture"/>
+            <wp:docPr descr="Fig. 5" title="" id="44" name="Picture"/>
             <a:graphic>
               <a:graphicData uri="http://schemas.openxmlformats.org/drawingml/2006/picture">
                 <pic:pic>
                   <pic:nvPicPr>
-                    <pic:cNvPr descr="plots/fig05_temperature_distributions.png" id="42" name="Picture"/>
+                    <pic:cNvPr descr="plots/fig05_temperature_distributions.png" id="45" name="Picture"/>
                     <pic:cNvPicPr>
                       <a:picLocks noChangeArrowheads="1" noChangeAspect="1"/>
                     </pic:cNvPicPr>
                   </pic:nvPicPr>
                   <pic:blipFill>
-                    <a:blip r:embed="rId40"/>
+                    <a:blip r:embed="rId43"/>
                     <a:stretch>
                       <a:fillRect/>
                     </a:stretch>
@@ -1893,8 +1974,8 @@
         <w:t xml:space="preserve">Distribution of daily 2 m temperature values, 1990–1999. Boxplots show the full distribution across all land pixels and all days for ERA5-Land (0.1°) and CMIP6 CESM2-WACCM (~1°). Box edges: 25th and 75th percentiles; whiskers: 1.5 × IQR; points: outliers. Data: ERA5-Land T2M and CMIP6 TAS, 24–38°N, 30–38°E.</w:t>
       </w:r>
     </w:p>
-    <w:bookmarkEnd w:id="43"/>
-    <w:bookmarkStart w:id="53" w:name="warming-trends"/>
+    <w:bookmarkEnd w:id="46"/>
+    <w:bookmarkStart w:id="56" w:name="warming-trends"/>
     <w:p>
       <w:pPr>
         <w:pStyle w:val="Heading3"/>
@@ -1956,135 +2037,12 @@
           <wp:inline>
             <wp:extent cx="5334000" cy="2068285"/>
             <wp:effectExtent b="0" l="0" r="0" t="0"/>
-            <wp:docPr descr="Fig. 10a" title="" id="45" name="Picture"/>
+            <wp:docPr descr="Fig. 10a" title="" id="48" name="Picture"/>
             <a:graphic>
               <a:graphicData uri="http://schemas.openxmlformats.org/drawingml/2006/picture">
                 <pic:pic>
                   <pic:nvPicPr>
-                    <pic:cNvPr descr="plots/fig10a_aug1_domain.png" id="46" name="Picture"/>
-                    <pic:cNvPicPr>
-                      <a:picLocks noChangeArrowheads="1" noChangeAspect="1"/>
-                    </pic:cNvPicPr>
-                  </pic:nvPicPr>
-                  <pic:blipFill>
-                    <a:blip r:embed="rId44"/>
-                    <a:stretch>
-                      <a:fillRect/>
-                    </a:stretch>
-                  </pic:blipFill>
-                  <pic:spPr bwMode="auto">
-                    <a:xfrm>
-                      <a:off x="0" y="0"/>
-                      <a:ext cx="5334000" cy="2068285"/>
-                    </a:xfrm>
-                    <a:prstGeom prst="rect">
-                      <a:avLst/>
-                    </a:prstGeom>
-                    <a:noFill/>
-                    <a:ln w="9525">
-                      <a:noFill/>
-                      <a:headEnd/>
-                      <a:tailEnd/>
-                    </a:ln>
-                  </pic:spPr>
-                </pic:pic>
-              </a:graphicData>
-            </a:graphic>
-          </wp:inline>
-        </w:drawing>
-      </w:r>
-    </w:p>
-    <w:p>
-      <w:pPr>
-        <w:pStyle w:val="ImageCaption"/>
-      </w:pPr>
-      <w:r>
-        <w:t xml:space="preserve">Fig. 10a</w:t>
-      </w:r>
-    </w:p>
-    <w:p>
-      <w:pPr>
-        <w:pStyle w:val="BodyText"/>
-      </w:pPr>
-      <w:r>
-        <w:rPr>
-          <w:b/>
-          <w:bCs/>
-        </w:rPr>
-        <w:t xml:space="preserve">Fig. 10a.</w:t>
-      </w:r>
-      <w:r>
-        <w:t xml:space="preserve"> </w:t>
-      </w:r>
-      <w:r>
-        <w:t xml:space="preserve">ERA5-Land and CMIP6 domain-wide minimum and maximum 2 m temperature on 1 August, 1990–1999. The shaded bands show the domain temperature range for each dataset. No consistent monotonic trend is visible across the ten years. Data: ERA5-Land T2M and CMIP6 TAS, 24–38°N, 30–38°E.</w:t>
-      </w:r>
-    </w:p>
-    <w:p>
-      <w:pPr>
-        <w:pStyle w:val="BodyText"/>
-      </w:pPr>
-      <w:r>
-        <w:rPr>
-          <w:b/>
-          <w:bCs/>
-        </w:rPr>
-        <w:t xml:space="preserve">Step 3 — Single pixel and single date (trend becomes discernible).</w:t>
-      </w:r>
-      <w:r>
-        <w:t xml:space="preserve"> </w:t>
-      </w:r>
-      <w:r>
-        <w:t xml:space="preserve">To further reduce noise, temperature was extracted from a single ERA5-Land pixel and its paired CMIP6 cell — the grid point closest to 35°E, 32°N (central Levant) — on 1 August of each year (Fig. 10b). At this point-scale, inter-annual noise is substantially lower than for the full domain. A linear OLS fit yields a positive trend of</w:t>
-      </w:r>
-      <w:r>
-        <w:t xml:space="preserve"> </w:t>
-      </w:r>
-      <w:r>
-        <w:rPr>
-          <w:b/>
-          <w:bCs/>
-        </w:rPr>
-        <w:t xml:space="preserve">+0.217 °C yr⁻¹</w:t>
-      </w:r>
-      <w:r>
-        <w:t xml:space="preserve"> </w:t>
-      </w:r>
-      <w:r>
-        <w:t xml:space="preserve">for ERA5-Land and</w:t>
-      </w:r>
-      <w:r>
-        <w:t xml:space="preserve"> </w:t>
-      </w:r>
-      <w:r>
-        <w:rPr>
-          <w:b/>
-          <w:bCs/>
-        </w:rPr>
-        <w:t xml:space="preserve">+0.121 °C yr⁻¹</w:t>
-      </w:r>
-      <w:r>
-        <w:t xml:space="preserve"> </w:t>
-      </w:r>
-      <w:r>
-        <w:t xml:space="preserve">for CMIP6 at this location over the decade. These values should be interpreted with caution: the 10-year record is too short to distinguish a forced trend from low-frequency natural variability, and a single pixel is subject to local noise not present in spatially averaged data.</w:t>
-      </w:r>
-    </w:p>
-    <w:p>
-      <w:pPr>
-        <w:pStyle w:val="CaptionedFigure"/>
-      </w:pPr>
-      <w:r>
-        <w:drawing>
-          <wp:inline>
-            <wp:extent cx="5334000" cy="2068285"/>
-            <wp:effectExtent b="0" l="0" r="0" t="0"/>
-            <wp:docPr descr="Fig. 10b" title="" id="48" name="Picture"/>
-            <a:graphic>
-              <a:graphicData uri="http://schemas.openxmlformats.org/drawingml/2006/picture">
-                <pic:pic>
-                  <pic:nvPicPr>
-                    <pic:cNvPr descr="plots/fig10b_aug1_pixel.png" id="49" name="Picture"/>
+                    <pic:cNvPr descr="plots/fig10a_aug1_domain.png" id="49" name="Picture"/>
                     <pic:cNvPicPr>
                       <a:picLocks noChangeArrowheads="1" noChangeAspect="1"/>
                     </pic:cNvPicPr>
@@ -2122,7 +2080,7 @@
         <w:pStyle w:val="ImageCaption"/>
       </w:pPr>
       <w:r>
-        <w:t xml:space="preserve">Fig. 10b</w:t>
+        <w:t xml:space="preserve">Fig. 10a</w:t>
       </w:r>
     </w:p>
     <w:p>
@@ -2134,13 +2092,13 @@
           <w:b/>
           <w:bCs/>
         </w:rPr>
-        <w:t xml:space="preserve">Fig. 10b.</w:t>
-      </w:r>
-      <w:r>
-        <w:t xml:space="preserve"> </w:t>
-      </w:r>
-      <w:r>
-        <w:t xml:space="preserve">2 m temperature on 1 August at the ERA5-Land pixel and CMIP6 cell nearest to 35°E, 32°N, 1990–1999. Dotted lines show OLS linear trend fits (ERA5-Land: +0.217 °C yr⁻¹; CMIP6: +0.121 °C yr⁻¹). Data: ERA5-Land T2M and CMIP6 TAS.</w:t>
+        <w:t xml:space="preserve">Fig. 10a.</w:t>
+      </w:r>
+      <w:r>
+        <w:t xml:space="preserve"> </w:t>
+      </w:r>
+      <w:r>
+        <w:t xml:space="preserve">ERA5-Land and CMIP6 domain-wide minimum and maximum 2 m temperature on 1 August, 1990–1999. The shaded bands show the domain temperature range for each dataset. No consistent monotonic trend is visible across the ten years. Data: ERA5-Land T2M and CMIP6 TAS, 24–38°N, 30–38°E.</w:t>
       </w:r>
     </w:p>
     <w:p>
@@ -2152,13 +2110,45 @@
           <w:b/>
           <w:bCs/>
         </w:rPr>
-        <w:t xml:space="preserve">Step 4 — Quarterly means at the representative location.</w:t>
-      </w:r>
-      <w:r>
-        <w:t xml:space="preserve"> </w:t>
-      </w:r>
-      <w:r>
-        <w:t xml:space="preserve">To obtain a more robust (less noisy) view of intra-decadal variability, quarterly (seasonal) mean temperatures were computed at the same location for each of the four meteorological seasons (Fig. 10). Seasonal means aggregate ~90 days per quarter, substantially reducing day-to-day noise relative to the single-date approach. The resulting time series confirm the general agreement between ERA5-Land and CMIP6 in terms of inter-annual variability, with CMIP6 exhibiting a systematic warm bias of ~1–2°C that is broadly constant across seasons and years. No season shows a statistically significant monotonic trend over the 10-year period, consistent with the domain-level analysis.</w:t>
+        <w:t xml:space="preserve">Step 3 — Single pixel and single date (trend becomes discernible).</w:t>
+      </w:r>
+      <w:r>
+        <w:t xml:space="preserve"> </w:t>
+      </w:r>
+      <w:r>
+        <w:t xml:space="preserve">To further reduce noise, temperature was extracted from a single ERA5-Land pixel and its paired CMIP6 cell — the grid point closest to 35°E, 32°N (central Levant) — on 1 August of each year (Fig. 10b). At this point-scale, inter-annual noise is substantially lower than for the full domain. A linear OLS fit yields a positive trend of</w:t>
+      </w:r>
+      <w:r>
+        <w:t xml:space="preserve"> </w:t>
+      </w:r>
+      <w:r>
+        <w:rPr>
+          <w:b/>
+          <w:bCs/>
+        </w:rPr>
+        <w:t xml:space="preserve">+0.217 °C yr⁻¹</w:t>
+      </w:r>
+      <w:r>
+        <w:t xml:space="preserve"> </w:t>
+      </w:r>
+      <w:r>
+        <w:t xml:space="preserve">for ERA5-Land and</w:t>
+      </w:r>
+      <w:r>
+        <w:t xml:space="preserve"> </w:t>
+      </w:r>
+      <w:r>
+        <w:rPr>
+          <w:b/>
+          <w:bCs/>
+        </w:rPr>
+        <w:t xml:space="preserve">+0.121 °C yr⁻¹</w:t>
+      </w:r>
+      <w:r>
+        <w:t xml:space="preserve"> </w:t>
+      </w:r>
+      <w:r>
+        <w:t xml:space="preserve">for CMIP6 at this location over the decade. These values should be interpreted with caution: the 10-year record is too short to distinguish a forced trend from low-frequency natural variability, and a single pixel is subject to local noise not present in spatially averaged data.</w:t>
       </w:r>
     </w:p>
     <w:p>
@@ -2168,20 +2158,111 @@
       <w:r>
         <w:drawing>
           <wp:inline>
-            <wp:extent cx="5334000" cy="3384908"/>
+            <wp:extent cx="5334000" cy="2068285"/>
             <wp:effectExtent b="0" l="0" r="0" t="0"/>
-            <wp:docPr descr="Fig. 10" title="" id="51" name="Picture"/>
+            <wp:docPr descr="Fig. 10b" title="" id="51" name="Picture"/>
             <a:graphic>
               <a:graphicData uri="http://schemas.openxmlformats.org/drawingml/2006/picture">
                 <pic:pic>
                   <pic:nvPicPr>
-                    <pic:cNvPr descr="plots/fig10_quarterly_warming_trend.png" id="52" name="Picture"/>
+                    <pic:cNvPr descr="plots/fig10b_aug1_pixel.png" id="52" name="Picture"/>
                     <pic:cNvPicPr>
                       <a:picLocks noChangeArrowheads="1" noChangeAspect="1"/>
                     </pic:cNvPicPr>
                   </pic:nvPicPr>
                   <pic:blipFill>
                     <a:blip r:embed="rId50"/>
+                    <a:stretch>
+                      <a:fillRect/>
+                    </a:stretch>
+                  </pic:blipFill>
+                  <pic:spPr bwMode="auto">
+                    <a:xfrm>
+                      <a:off x="0" y="0"/>
+                      <a:ext cx="5334000" cy="2068285"/>
+                    </a:xfrm>
+                    <a:prstGeom prst="rect">
+                      <a:avLst/>
+                    </a:prstGeom>
+                    <a:noFill/>
+                    <a:ln w="9525">
+                      <a:noFill/>
+                      <a:headEnd/>
+                      <a:tailEnd/>
+                    </a:ln>
+                  </pic:spPr>
+                </pic:pic>
+              </a:graphicData>
+            </a:graphic>
+          </wp:inline>
+        </w:drawing>
+      </w:r>
+    </w:p>
+    <w:p>
+      <w:pPr>
+        <w:pStyle w:val="ImageCaption"/>
+      </w:pPr>
+      <w:r>
+        <w:t xml:space="preserve">Fig. 10b</w:t>
+      </w:r>
+    </w:p>
+    <w:p>
+      <w:pPr>
+        <w:pStyle w:val="BodyText"/>
+      </w:pPr>
+      <w:r>
+        <w:rPr>
+          <w:b/>
+          <w:bCs/>
+        </w:rPr>
+        <w:t xml:space="preserve">Fig. 10b.</w:t>
+      </w:r>
+      <w:r>
+        <w:t xml:space="preserve"> </w:t>
+      </w:r>
+      <w:r>
+        <w:t xml:space="preserve">2 m temperature on 1 August at the ERA5-Land pixel and CMIP6 cell nearest to 35°E, 32°N, 1990–1999. Dotted lines show OLS linear trend fits (ERA5-Land: +0.217 °C yr⁻¹; CMIP6: +0.121 °C yr⁻¹). Data: ERA5-Land T2M and CMIP6 TAS.</w:t>
+      </w:r>
+    </w:p>
+    <w:p>
+      <w:pPr>
+        <w:pStyle w:val="BodyText"/>
+      </w:pPr>
+      <w:r>
+        <w:rPr>
+          <w:b/>
+          <w:bCs/>
+        </w:rPr>
+        <w:t xml:space="preserve">Step 4 — Quarterly means at the representative location.</w:t>
+      </w:r>
+      <w:r>
+        <w:t xml:space="preserve"> </w:t>
+      </w:r>
+      <w:r>
+        <w:t xml:space="preserve">To obtain a more robust (less noisy) view of intra-decadal variability, quarterly (seasonal) mean temperatures were computed at the same location for each of the four meteorological seasons (Fig. 10). Seasonal means aggregate ~90 days per quarter, substantially reducing day-to-day noise relative to the single-date approach. The resulting time series confirm the general agreement between ERA5-Land and CMIP6 in terms of inter-annual variability, with CMIP6 exhibiting a systematic warm bias of ~1–2°C that is broadly constant across seasons and years. No season shows a statistically significant monotonic trend over the 10-year period, consistent with the domain-level analysis.</w:t>
+      </w:r>
+    </w:p>
+    <w:p>
+      <w:pPr>
+        <w:pStyle w:val="CaptionedFigure"/>
+      </w:pPr>
+      <w:r>
+        <w:drawing>
+          <wp:inline>
+            <wp:extent cx="5334000" cy="3384908"/>
+            <wp:effectExtent b="0" l="0" r="0" t="0"/>
+            <wp:docPr descr="Fig. 10" title="" id="54" name="Picture"/>
+            <a:graphic>
+              <a:graphicData uri="http://schemas.openxmlformats.org/drawingml/2006/picture">
+                <pic:pic>
+                  <pic:nvPicPr>
+                    <pic:cNvPr descr="plots/fig10_quarterly_warming_trend.png" id="55" name="Picture"/>
+                    <pic:cNvPicPr>
+                      <a:picLocks noChangeArrowheads="1" noChangeAspect="1"/>
+                    </pic:cNvPicPr>
+                  </pic:nvPicPr>
+                  <pic:blipFill>
+                    <a:blip r:embed="rId53"/>
                     <a:stretch>
                       <a:fillRect/>
                     </a:stretch>
@@ -2241,9 +2322,9 @@
         </w:pict>
       </w:r>
     </w:p>
-    <w:bookmarkEnd w:id="53"/>
-    <w:bookmarkEnd w:id="54"/>
-    <w:bookmarkStart w:id="60" w:name="pairing-mechanism"/>
+    <w:bookmarkEnd w:id="56"/>
+    <w:bookmarkEnd w:id="57"/>
+    <w:bookmarkStart w:id="63" w:name="pairing-mechanism"/>
     <w:p>
       <w:pPr>
         <w:pStyle w:val="Heading2"/>
@@ -2252,7 +2333,7 @@
         <w:t xml:space="preserve">6. Pairing Mechanism</w:t>
       </w:r>
     </w:p>
-    <w:bookmarkStart w:id="58" w:name="Xb36677fb3fe1709fefca644ed317d1693f1c825"/>
+    <w:bookmarkStart w:id="61" w:name="Xb36677fb3fe1709fefca644ed317d1693f1c825"/>
     <w:p>
       <w:pPr>
         <w:pStyle w:val="Heading3"/>
@@ -2554,18 +2635,18 @@
           <wp:inline>
             <wp:extent cx="5334000" cy="4462618"/>
             <wp:effectExtent b="0" l="0" r="0" t="0"/>
-            <wp:docPr descr="Fig. 6" title="" id="56" name="Picture"/>
+            <wp:docPr descr="Fig. 6" title="" id="59" name="Picture"/>
             <a:graphic>
               <a:graphicData uri="http://schemas.openxmlformats.org/drawingml/2006/picture">
                 <pic:pic>
                   <pic:nvPicPr>
-                    <pic:cNvPr descr="plots/fig06_pixels_per_cmip_cell.png" id="57" name="Picture"/>
+                    <pic:cNvPr descr="plots/fig06_pixels_per_cmip_cell.png" id="60" name="Picture"/>
                     <pic:cNvPicPr>
                       <a:picLocks noChangeArrowheads="1" noChangeAspect="1"/>
                     </pic:cNvPicPr>
                   </pic:nvPicPr>
                   <pic:blipFill>
-                    <a:blip r:embed="rId55"/>
+                    <a:blip r:embed="rId58"/>
                     <a:stretch>
                       <a:fillRect/>
                     </a:stretch>
@@ -2618,8 +2699,8 @@
         <w:t xml:space="preserve">Number of ERA5-Land (0.1°) land pixels assigned to each CMIP6 CESM2-WACCM grid cell by nearest-neighbour matching. Cells located entirely over land receive the greatest number of ERA5-Land pixels; coastal cells straddling the land–sea boundary receive the fewest. Data: ERA5-Land and CMIP6 CESM2-WACCM, study region 24–38°N, 30–38°E.</w:t>
       </w:r>
     </w:p>
-    <w:bookmarkEnd w:id="58"/>
-    <w:bookmarkStart w:id="59" w:name="cmip6-grid-padding"/>
+    <w:bookmarkEnd w:id="61"/>
+    <w:bookmarkStart w:id="62" w:name="cmip6-grid-padding"/>
     <w:p>
       <w:pPr>
         <w:pStyle w:val="Heading3"/>
@@ -2643,9 +2724,9 @@
         </w:pict>
       </w:r>
     </w:p>
-    <w:bookmarkEnd w:id="59"/>
-    <w:bookmarkEnd w:id="60"/>
-    <w:bookmarkStart w:id="76" w:name="coarsefine-temperature-relationship"/>
+    <w:bookmarkEnd w:id="62"/>
+    <w:bookmarkEnd w:id="63"/>
+    <w:bookmarkStart w:id="79" w:name="coarsefine-temperature-relationship"/>
     <w:p>
       <w:pPr>
         <w:pStyle w:val="Heading2"/>
@@ -2654,7 +2735,7 @@
         <w:t xml:space="preserve">7. Coarse–Fine Temperature Relationship</w:t>
       </w:r>
     </w:p>
-    <w:bookmarkStart w:id="64" w:name="linear-relationship"/>
+    <w:bookmarkStart w:id="67" w:name="linear-relationship"/>
     <w:p>
       <w:pPr>
         <w:pStyle w:val="Heading3"/>
@@ -2773,18 +2854,18 @@
           <wp:inline>
             <wp:extent cx="5334000" cy="2315147"/>
             <wp:effectExtent b="0" l="0" r="0" t="0"/>
-            <wp:docPr descr="Fig. 7" title="" id="62" name="Picture"/>
+            <wp:docPr descr="Fig. 7" title="" id="65" name="Picture"/>
             <a:graphic>
               <a:graphicData uri="http://schemas.openxmlformats.org/drawingml/2006/picture">
                 <pic:pic>
                   <pic:nvPicPr>
-                    <pic:cNvPr descr="plots/fig07_scatter_regression.png" id="63" name="Picture"/>
+                    <pic:cNvPr descr="plots/fig07_scatter_regression.png" id="66" name="Picture"/>
                     <pic:cNvPicPr>
                       <a:picLocks noChangeArrowheads="1" noChangeAspect="1"/>
                     </pic:cNvPicPr>
                   </pic:nvPicPr>
                   <pic:blipFill>
-                    <a:blip r:embed="rId61"/>
+                    <a:blip r:embed="rId64"/>
                     <a:stretch>
                       <a:fillRect/>
                     </a:stretch>
@@ -2853,8 +2934,8 @@
         <w:t xml:space="preserve">annotated). Data: ERA5-Land T2M and CMIP6 TAS, 24–38°N, 30–38°E.</w:t>
       </w:r>
     </w:p>
-    <w:bookmarkEnd w:id="64"/>
-    <w:bookmarkStart w:id="68" w:name="residual-diagnostics"/>
+    <w:bookmarkEnd w:id="67"/>
+    <w:bookmarkStart w:id="71" w:name="residual-diagnostics"/>
     <w:p>
       <w:pPr>
         <w:pStyle w:val="Heading3"/>
@@ -2880,18 +2961,18 @@
           <wp:inline>
             <wp:extent cx="5334000" cy="2284063"/>
             <wp:effectExtent b="0" l="0" r="0" t="0"/>
-            <wp:docPr descr="Fig. 8" title="" id="66" name="Picture"/>
+            <wp:docPr descr="Fig. 8" title="" id="69" name="Picture"/>
             <a:graphic>
               <a:graphicData uri="http://schemas.openxmlformats.org/drawingml/2006/picture">
                 <pic:pic>
                   <pic:nvPicPr>
-                    <pic:cNvPr descr="plots/fig08_residual_analysis.png" id="67" name="Picture"/>
+                    <pic:cNvPr descr="plots/fig08_residual_analysis.png" id="70" name="Picture"/>
                     <pic:cNvPicPr>
                       <a:picLocks noChangeArrowheads="1" noChangeAspect="1"/>
                     </pic:cNvPicPr>
                   </pic:nvPicPr>
                   <pic:blipFill>
-                    <a:blip r:embed="rId65"/>
+                    <a:blip r:embed="rId68"/>
                     <a:stretch>
                       <a:fillRect/>
                     </a:stretch>
@@ -2944,8 +3025,8 @@
         <w:t xml:space="preserve">OLS residual diagnostics, 1990–1999. Panel (a): residuals versus CMIP6 TAS value; a horizontal band near zero indicates homoscedasticity. Panel (b): residuals versus Euclidean distance from the assigned CMIP6 cell centre in degrees; a non-zero slope would indicate boundary-assignment artefacts. Data: ERA5-Land T2M and CMIP6 TAS, 24–38°N, 30–38°E.</w:t>
       </w:r>
     </w:p>
-    <w:bookmarkEnd w:id="68"/>
-    <w:bookmarkStart w:id="75" w:name="Xcc6ba20f731b5af548538617341ce41f8bcf6f1"/>
+    <w:bookmarkEnd w:id="71"/>
+    <w:bookmarkStart w:id="78" w:name="Xcc6ba20f731b5af548538617341ce41f8bcf6f1"/>
     <w:p>
       <w:pPr>
         <w:pStyle w:val="Heading3"/>
@@ -2981,85 +3062,12 @@
           <wp:inline>
             <wp:extent cx="5334000" cy="2901478"/>
             <wp:effectExtent b="0" l="0" r="0" t="0"/>
-            <wp:docPr descr="Fig. 11" title="" id="70" name="Picture"/>
+            <wp:docPr descr="Fig. 11" title="" id="73" name="Picture"/>
             <a:graphic>
               <a:graphicData uri="http://schemas.openxmlformats.org/drawingml/2006/picture">
                 <pic:pic>
                   <pic:nvPicPr>
-                    <pic:cNvPr descr="plots/fig11_residuals_by_sea_fraction.png" id="71" name="Picture"/>
-                    <pic:cNvPicPr>
-                      <a:picLocks noChangeArrowheads="1" noChangeAspect="1"/>
-                    </pic:cNvPicPr>
-                  </pic:nvPicPr>
-                  <pic:blipFill>
-                    <a:blip r:embed="rId69"/>
-                    <a:stretch>
-                      <a:fillRect/>
-                    </a:stretch>
-                  </pic:blipFill>
-                  <pic:spPr bwMode="auto">
-                    <a:xfrm>
-                      <a:off x="0" y="0"/>
-                      <a:ext cx="5334000" cy="2901478"/>
-                    </a:xfrm>
-                    <a:prstGeom prst="rect">
-                      <a:avLst/>
-                    </a:prstGeom>
-                    <a:noFill/>
-                    <a:ln w="9525">
-                      <a:noFill/>
-                      <a:headEnd/>
-                      <a:tailEnd/>
-                    </a:ln>
-                  </pic:spPr>
-                </pic:pic>
-              </a:graphicData>
-            </a:graphic>
-          </wp:inline>
-        </w:drawing>
-      </w:r>
-    </w:p>
-    <w:p>
-      <w:pPr>
-        <w:pStyle w:val="ImageCaption"/>
-      </w:pPr>
-      <w:r>
-        <w:t xml:space="preserve">Fig. 11</w:t>
-      </w:r>
-    </w:p>
-    <w:p>
-      <w:pPr>
-        <w:pStyle w:val="BodyText"/>
-      </w:pPr>
-      <w:r>
-        <w:rPr>
-          <w:b/>
-          <w:bCs/>
-        </w:rPr>
-        <w:t xml:space="preserve">Fig. 11.</w:t>
-      </w:r>
-      <w:r>
-        <w:t xml:space="preserve"> </w:t>
-      </w:r>
-      <w:r>
-        <w:t xml:space="preserve">OLS residual distribution by CMIP6 cell sea fraction, 1990–1999. Each box summarises all pixel×day residuals for CMIP6 cells within a given sea-fraction bin (20% intervals). Data: ERA5-Land T2M and CMIP6 TAS, 24–38°N, 30–38°E.</w:t>
-      </w:r>
-    </w:p>
-    <w:p>
-      <w:pPr>
-        <w:pStyle w:val="CaptionedFigure"/>
-      </w:pPr>
-      <w:r>
-        <w:drawing>
-          <wp:inline>
-            <wp:extent cx="5334000" cy="2901478"/>
-            <wp:effectExtent b="0" l="0" r="0" t="0"/>
-            <wp:docPr descr="Fig. 12" title="" id="73" name="Picture"/>
-            <a:graphic>
-              <a:graphicData uri="http://schemas.openxmlformats.org/drawingml/2006/picture">
-                <pic:pic>
-                  <pic:nvPicPr>
-                    <pic:cNvPr descr="plots/fig12_residuals_by_pixel_count.png" id="74" name="Picture"/>
+                    <pic:cNvPr descr="plots/fig11_residuals_by_sea_fraction.png" id="74" name="Picture"/>
                     <pic:cNvPicPr>
                       <a:picLocks noChangeArrowheads="1" noChangeAspect="1"/>
                     </pic:cNvPicPr>
@@ -3097,7 +3105,7 @@
         <w:pStyle w:val="ImageCaption"/>
       </w:pPr>
       <w:r>
-        <w:t xml:space="preserve">Fig. 12</w:t>
+        <w:t xml:space="preserve">Fig. 11</w:t>
       </w:r>
     </w:p>
     <w:p>
@@ -3109,57 +3117,13 @@
           <w:b/>
           <w:bCs/>
         </w:rPr>
-        <w:t xml:space="preserve">Fig. 12.</w:t>
-      </w:r>
-      <w:r>
-        <w:t xml:space="preserve"> </w:t>
-      </w:r>
-      <w:r>
-        <w:t xml:space="preserve">OLS residual distribution by CMIP6 cell land-pixel count, 1990–1999. Each box summarises all pixel×day residuals for CMIP6 cells within a given pixel-count quantile bin. Data: ERA5-Land T2M and CMIP6 TAS, 24–38°N, 30–38°E.</w:t>
-      </w:r>
-    </w:p>
-    <w:p>
-      <w:r>
-        <w:pict>
-          <v:rect style="width:0;height:1.5pt" o:hralign="center" o:hrstd="t" o:hr="t"/>
-        </w:pict>
-      </w:r>
-    </w:p>
-    <w:bookmarkEnd w:id="75"/>
-    <w:bookmarkEnd w:id="76"/>
-    <w:bookmarkStart w:id="80" w:name="feature-engineering-work-in-progress"/>
-    <w:p>
-      <w:pPr>
-        <w:pStyle w:val="Heading2"/>
-      </w:pPr>
-      <w:r>
-        <w:t xml:space="preserve">8. Feature Engineering</w:t>
-      </w:r>
-      <w:r>
-        <w:t xml:space="preserve"> </w:t>
-      </w:r>
-      <w:r>
-        <w:rPr>
-          <w:i/>
-          <w:iCs/>
-        </w:rPr>
-        <w:t xml:space="preserve">(work in progress)</w:t>
-      </w:r>
-    </w:p>
-    <w:p>
-      <w:pPr>
-        <w:pStyle w:val="FirstParagraph"/>
-      </w:pPr>
-      <w:r>
-        <w:t xml:space="preserve">As proposed by Dorita Morin, the area-weighted global mean daily TAS from the CMIP6 model (computed over all grid cells worldwide) provides a large-scale thermodynamic predictor. This global signal encodes the overall state of the climate system on each day and may improve downscaling performance beyond the local cell temperature alone by capturing the background warming state.</w:t>
-      </w:r>
-    </w:p>
-    <w:p>
-      <w:pPr>
-        <w:pStyle w:val="BodyText"/>
-      </w:pPr>
-      <w:r>
-        <w:t xml:space="preserve">Fig. 9 shows the global mean TAS time series for 1990–1999. The seasonal cycle is clearly visible, and the global mean is substantially lower (~14°C) than the EMME regional mean (~20.5°C), as expected for a global average that includes polar regions.</w:t>
+        <w:t xml:space="preserve">Fig. 11.</w:t>
+      </w:r>
+      <w:r>
+        <w:t xml:space="preserve"> </w:t>
+      </w:r>
+      <w:r>
+        <w:t xml:space="preserve">OLS residual distribution by CMIP6 cell sea fraction, 1990–1999. Each box summarises all pixel×day residuals for CMIP6 cells within a given sea-fraction bin (20% intervals). Data: ERA5-Land T2M and CMIP6 TAS, 24–38°N, 30–38°E.</w:t>
       </w:r>
     </w:p>
     <w:p>
@@ -3169,20 +3133,137 @@
       <w:r>
         <w:drawing>
           <wp:inline>
-            <wp:extent cx="5334000" cy="1718532"/>
+            <wp:extent cx="5334000" cy="2901478"/>
             <wp:effectExtent b="0" l="0" r="0" t="0"/>
-            <wp:docPr descr="Fig. 9" title="" id="78" name="Picture"/>
+            <wp:docPr descr="Fig. 12" title="" id="76" name="Picture"/>
             <a:graphic>
               <a:graphicData uri="http://schemas.openxmlformats.org/drawingml/2006/picture">
                 <pic:pic>
                   <pic:nvPicPr>
-                    <pic:cNvPr descr="plots/fig09_global_mean_tas.png" id="79" name="Picture"/>
+                    <pic:cNvPr descr="plots/fig12_residuals_by_pixel_count.png" id="77" name="Picture"/>
                     <pic:cNvPicPr>
                       <a:picLocks noChangeArrowheads="1" noChangeAspect="1"/>
                     </pic:cNvPicPr>
                   </pic:nvPicPr>
                   <pic:blipFill>
-                    <a:blip r:embed="rId77"/>
+                    <a:blip r:embed="rId75"/>
+                    <a:stretch>
+                      <a:fillRect/>
+                    </a:stretch>
+                  </pic:blipFill>
+                  <pic:spPr bwMode="auto">
+                    <a:xfrm>
+                      <a:off x="0" y="0"/>
+                      <a:ext cx="5334000" cy="2901478"/>
+                    </a:xfrm>
+                    <a:prstGeom prst="rect">
+                      <a:avLst/>
+                    </a:prstGeom>
+                    <a:noFill/>
+                    <a:ln w="9525">
+                      <a:noFill/>
+                      <a:headEnd/>
+                      <a:tailEnd/>
+                    </a:ln>
+                  </pic:spPr>
+                </pic:pic>
+              </a:graphicData>
+            </a:graphic>
+          </wp:inline>
+        </w:drawing>
+      </w:r>
+    </w:p>
+    <w:p>
+      <w:pPr>
+        <w:pStyle w:val="ImageCaption"/>
+      </w:pPr>
+      <w:r>
+        <w:t xml:space="preserve">Fig. 12</w:t>
+      </w:r>
+    </w:p>
+    <w:p>
+      <w:pPr>
+        <w:pStyle w:val="BodyText"/>
+      </w:pPr>
+      <w:r>
+        <w:rPr>
+          <w:b/>
+          <w:bCs/>
+        </w:rPr>
+        <w:t xml:space="preserve">Fig. 12.</w:t>
+      </w:r>
+      <w:r>
+        <w:t xml:space="preserve"> </w:t>
+      </w:r>
+      <w:r>
+        <w:t xml:space="preserve">OLS residual distribution by CMIP6 cell land-pixel count, 1990–1999. Each box summarises all pixel×day residuals for CMIP6 cells within a given pixel-count quantile bin. Data: ERA5-Land T2M and CMIP6 TAS, 24–38°N, 30–38°E.</w:t>
+      </w:r>
+    </w:p>
+    <w:p>
+      <w:r>
+        <w:pict>
+          <v:rect style="width:0;height:1.5pt" o:hralign="center" o:hrstd="t" o:hr="t"/>
+        </w:pict>
+      </w:r>
+    </w:p>
+    <w:bookmarkEnd w:id="78"/>
+    <w:bookmarkEnd w:id="79"/>
+    <w:bookmarkStart w:id="83" w:name="feature-engineering-work-in-progress"/>
+    <w:p>
+      <w:pPr>
+        <w:pStyle w:val="Heading2"/>
+      </w:pPr>
+      <w:r>
+        <w:t xml:space="preserve">8. Feature Engineering</w:t>
+      </w:r>
+      <w:r>
+        <w:t xml:space="preserve"> </w:t>
+      </w:r>
+      <w:r>
+        <w:rPr>
+          <w:i/>
+          <w:iCs/>
+        </w:rPr>
+        <w:t xml:space="preserve">(work in progress)</w:t>
+      </w:r>
+    </w:p>
+    <w:p>
+      <w:pPr>
+        <w:pStyle w:val="FirstParagraph"/>
+      </w:pPr>
+      <w:r>
+        <w:t xml:space="preserve">As proposed by Dorita Morin, the area-weighted global mean daily TAS from the CMIP6 model (computed over all grid cells worldwide) provides a large-scale thermodynamic predictor. This global signal encodes the overall state of the climate system on each day and may improve downscaling performance beyond the local cell temperature alone by capturing the background warming state.</w:t>
+      </w:r>
+    </w:p>
+    <w:p>
+      <w:pPr>
+        <w:pStyle w:val="BodyText"/>
+      </w:pPr>
+      <w:r>
+        <w:t xml:space="preserve">Fig. 9 shows the global mean TAS time series for 1990–1999. The seasonal cycle is clearly visible, and the global mean is substantially lower (~14°C) than the EMME regional mean (~20.5°C), as expected for a global average that includes polar regions.</w:t>
+      </w:r>
+    </w:p>
+    <w:p>
+      <w:pPr>
+        <w:pStyle w:val="CaptionedFigure"/>
+      </w:pPr>
+      <w:r>
+        <w:drawing>
+          <wp:inline>
+            <wp:extent cx="5334000" cy="1718532"/>
+            <wp:effectExtent b="0" l="0" r="0" t="0"/>
+            <wp:docPr descr="Fig. 9" title="" id="81" name="Picture"/>
+            <a:graphic>
+              <a:graphicData uri="http://schemas.openxmlformats.org/drawingml/2006/picture">
+                <pic:pic>
+                  <pic:nvPicPr>
+                    <pic:cNvPr descr="plots/fig09_global_mean_tas.png" id="82" name="Picture"/>
+                    <pic:cNvPicPr>
+                      <a:picLocks noChangeArrowheads="1" noChangeAspect="1"/>
+                    </pic:cNvPicPr>
+                  </pic:nvPicPr>
+                  <pic:blipFill>
+                    <a:blip r:embed="rId80"/>
                     <a:stretch>
                       <a:fillRect/>
                     </a:stretch>
@@ -3242,8 +3323,8 @@
         </w:pict>
       </w:r>
     </w:p>
-    <w:bookmarkEnd w:id="80"/>
-    <w:bookmarkStart w:id="81" w:name="next-steps"/>
+    <w:bookmarkEnd w:id="83"/>
+    <w:bookmarkStart w:id="84" w:name="next-steps"/>
     <w:p>
       <w:pPr>
         <w:pStyle w:val="Heading2"/>
@@ -3393,8 +3474,8 @@
         <w:t xml:space="preserve">— Random forests, gradient boosting, and neural network architectures will be evaluated against the linear baseline using spatial RMSE, bias, and correlation maps.</w:t>
       </w:r>
     </w:p>
-    <w:bookmarkEnd w:id="81"/>
-    <w:bookmarkEnd w:id="82"/>
+    <w:bookmarkEnd w:id="84"/>
+    <w:bookmarkEnd w:id="85"/>
     <w:sectPr>
       <w:footnotePr>
         <w:numRestart w:val="eachSect"/>

</xml_diff>